<commit_message>
fix: update documentation links in Docs component for English and Hungarian versions
</commit_message>
<xml_diff>
--- a/documents/Documentation_MaxxedOut-HU.docx
+++ b/documents/Documentation_MaxxedOut-HU.docx
@@ -301,7 +301,7 @@
       <w:bookmarkEnd w:id="0"/>
       <w:bookmarkEnd w:id="1"/>
     </w:p>
-    <w:bookmarkStart w:id="2" w:name="_Toc227408468" w:displacedByCustomXml="next"/>
+    <w:bookmarkStart w:id="2" w:name="_Toc228110341" w:displacedByCustomXml="next"/>
     <w:sdt>
       <w:sdtPr>
         <w:rPr>
@@ -359,7 +359,7 @@
           <w:r>
             <w:fldChar w:fldCharType="separate"/>
           </w:r>
-          <w:hyperlink w:anchor="_Toc227408468" w:history="1">
+          <w:hyperlink w:anchor="_Toc228110341" w:history="1">
             <w:r>
               <w:rPr>
                 <w:rStyle w:val="Hiperhivatkozs"/>
@@ -386,7 +386,7 @@
                 <w:noProof/>
                 <w:webHidden/>
               </w:rPr>
-              <w:instrText xml:space="preserve"> PAGEREF _Toc227408468 \h </w:instrText>
+              <w:instrText xml:space="preserve"> PAGEREF _Toc228110341 \h </w:instrText>
             </w:r>
             <w:r>
               <w:rPr>
@@ -433,7 +433,7 @@
               <w14:ligatures w14:val="standardContextual"/>
             </w:rPr>
           </w:pPr>
-          <w:hyperlink w:anchor="_Toc227408469" w:history="1">
+          <w:hyperlink w:anchor="_Toc228110342" w:history="1">
             <w:r>
               <w:rPr>
                 <w:rStyle w:val="Hiperhivatkozs"/>
@@ -460,7 +460,7 @@
                 <w:noProof/>
                 <w:webHidden/>
               </w:rPr>
-              <w:instrText xml:space="preserve"> PAGEREF _Toc227408469 \h </w:instrText>
+              <w:instrText xml:space="preserve"> PAGEREF _Toc228110342 \h </w:instrText>
             </w:r>
             <w:r>
               <w:rPr>
@@ -507,7 +507,7 @@
               <w14:ligatures w14:val="standardContextual"/>
             </w:rPr>
           </w:pPr>
-          <w:hyperlink w:anchor="_Toc227408470" w:history="1">
+          <w:hyperlink w:anchor="_Toc228110343" w:history="1">
             <w:r>
               <w:rPr>
                 <w:rStyle w:val="Hiperhivatkozs"/>
@@ -534,7 +534,7 @@
                 <w:noProof/>
                 <w:webHidden/>
               </w:rPr>
-              <w:instrText xml:space="preserve"> PAGEREF _Toc227408470 \h </w:instrText>
+              <w:instrText xml:space="preserve"> PAGEREF _Toc228110343 \h </w:instrText>
             </w:r>
             <w:r>
               <w:rPr>
@@ -581,7 +581,7 @@
               <w14:ligatures w14:val="standardContextual"/>
             </w:rPr>
           </w:pPr>
-          <w:hyperlink w:anchor="_Toc227408471" w:history="1">
+          <w:hyperlink w:anchor="_Toc228110344" w:history="1">
             <w:r>
               <w:rPr>
                 <w:rStyle w:val="Hiperhivatkozs"/>
@@ -608,7 +608,7 @@
                 <w:noProof/>
                 <w:webHidden/>
               </w:rPr>
-              <w:instrText xml:space="preserve"> PAGEREF _Toc227408471 \h </w:instrText>
+              <w:instrText xml:space="preserve"> PAGEREF _Toc228110344 \h </w:instrText>
             </w:r>
             <w:r>
               <w:rPr>
@@ -655,7 +655,7 @@
               <w14:ligatures w14:val="standardContextual"/>
             </w:rPr>
           </w:pPr>
-          <w:hyperlink w:anchor="_Toc227408472" w:history="1">
+          <w:hyperlink w:anchor="_Toc228110345" w:history="1">
             <w:r>
               <w:rPr>
                 <w:rStyle w:val="Hiperhivatkozs"/>
@@ -682,7 +682,7 @@
                 <w:noProof/>
                 <w:webHidden/>
               </w:rPr>
-              <w:instrText xml:space="preserve"> PAGEREF _Toc227408472 \h </w:instrText>
+              <w:instrText xml:space="preserve"> PAGEREF _Toc228110345 \h </w:instrText>
             </w:r>
             <w:r>
               <w:rPr>
@@ -729,7 +729,7 @@
               <w14:ligatures w14:val="standardContextual"/>
             </w:rPr>
           </w:pPr>
-          <w:hyperlink w:anchor="_Toc227408473" w:history="1">
+          <w:hyperlink w:anchor="_Toc228110346" w:history="1">
             <w:r>
               <w:rPr>
                 <w:rStyle w:val="Hiperhivatkozs"/>
@@ -758,7 +758,7 @@
                 <w:noProof/>
                 <w:webHidden/>
               </w:rPr>
-              <w:instrText xml:space="preserve"> PAGEREF _Toc227408473 \h </w:instrText>
+              <w:instrText xml:space="preserve"> PAGEREF _Toc228110346 \h </w:instrText>
             </w:r>
             <w:r>
               <w:rPr>
@@ -805,7 +805,7 @@
               <w14:ligatures w14:val="standardContextual"/>
             </w:rPr>
           </w:pPr>
-          <w:hyperlink w:anchor="_Toc227408474" w:history="1">
+          <w:hyperlink w:anchor="_Toc228110347" w:history="1">
             <w:r>
               <w:rPr>
                 <w:rStyle w:val="Hiperhivatkozs"/>
@@ -832,7 +832,7 @@
                 <w:noProof/>
                 <w:webHidden/>
               </w:rPr>
-              <w:instrText xml:space="preserve"> PAGEREF _Toc227408474 \h </w:instrText>
+              <w:instrText xml:space="preserve"> PAGEREF _Toc228110347 \h </w:instrText>
             </w:r>
             <w:r>
               <w:rPr>
@@ -879,7 +879,7 @@
               <w14:ligatures w14:val="standardContextual"/>
             </w:rPr>
           </w:pPr>
-          <w:hyperlink w:anchor="_Toc227408475" w:history="1">
+          <w:hyperlink w:anchor="_Toc228110348" w:history="1">
             <w:r>
               <w:rPr>
                 <w:rStyle w:val="Hiperhivatkozs"/>
@@ -908,7 +908,7 @@
                 <w:noProof/>
                 <w:webHidden/>
               </w:rPr>
-              <w:instrText xml:space="preserve"> PAGEREF _Toc227408475 \h </w:instrText>
+              <w:instrText xml:space="preserve"> PAGEREF _Toc228110348 \h </w:instrText>
             </w:r>
             <w:r>
               <w:rPr>
@@ -955,7 +955,7 @@
               <w14:ligatures w14:val="standardContextual"/>
             </w:rPr>
           </w:pPr>
-          <w:hyperlink w:anchor="_Toc227408476" w:history="1">
+          <w:hyperlink w:anchor="_Toc228110349" w:history="1">
             <w:r>
               <w:rPr>
                 <w:rStyle w:val="Hiperhivatkozs"/>
@@ -982,7 +982,7 @@
                 <w:noProof/>
                 <w:webHidden/>
               </w:rPr>
-              <w:instrText xml:space="preserve"> PAGEREF _Toc227408476 \h </w:instrText>
+              <w:instrText xml:space="preserve"> PAGEREF _Toc228110349 \h </w:instrText>
             </w:r>
             <w:r>
               <w:rPr>
@@ -1029,7 +1029,7 @@
               <w14:ligatures w14:val="standardContextual"/>
             </w:rPr>
           </w:pPr>
-          <w:hyperlink w:anchor="_Toc227408477" w:history="1">
+          <w:hyperlink w:anchor="_Toc228110350" w:history="1">
             <w:r>
               <w:rPr>
                 <w:rStyle w:val="Hiperhivatkozs"/>
@@ -1056,7 +1056,7 @@
                 <w:noProof/>
                 <w:webHidden/>
               </w:rPr>
-              <w:instrText xml:space="preserve"> PAGEREF _Toc227408477 \h </w:instrText>
+              <w:instrText xml:space="preserve"> PAGEREF _Toc228110350 \h </w:instrText>
             </w:r>
             <w:r>
               <w:rPr>
@@ -1103,7 +1103,7 @@
               <w14:ligatures w14:val="standardContextual"/>
             </w:rPr>
           </w:pPr>
-          <w:hyperlink w:anchor="_Toc227408478" w:history="1">
+          <w:hyperlink w:anchor="_Toc228110351" w:history="1">
             <w:r>
               <w:rPr>
                 <w:rStyle w:val="Hiperhivatkozs"/>
@@ -1130,7 +1130,7 @@
                 <w:noProof/>
                 <w:webHidden/>
               </w:rPr>
-              <w:instrText xml:space="preserve"> PAGEREF _Toc227408478 \h </w:instrText>
+              <w:instrText xml:space="preserve"> PAGEREF _Toc228110351 \h </w:instrText>
             </w:r>
             <w:r>
               <w:rPr>
@@ -1177,7 +1177,7 @@
               <w14:ligatures w14:val="standardContextual"/>
             </w:rPr>
           </w:pPr>
-          <w:hyperlink w:anchor="_Toc227408479" w:history="1">
+          <w:hyperlink w:anchor="_Toc228110352" w:history="1">
             <w:r>
               <w:rPr>
                 <w:rStyle w:val="Hiperhivatkozs"/>
@@ -1204,7 +1204,7 @@
                 <w:noProof/>
                 <w:webHidden/>
               </w:rPr>
-              <w:instrText xml:space="preserve"> PAGEREF _Toc227408479 \h </w:instrText>
+              <w:instrText xml:space="preserve"> PAGEREF _Toc228110352 \h </w:instrText>
             </w:r>
             <w:r>
               <w:rPr>
@@ -1251,7 +1251,7 @@
               <w14:ligatures w14:val="standardContextual"/>
             </w:rPr>
           </w:pPr>
-          <w:hyperlink w:anchor="_Toc227408480" w:history="1">
+          <w:hyperlink w:anchor="_Toc228110353" w:history="1">
             <w:r>
               <w:rPr>
                 <w:rStyle w:val="Hiperhivatkozs"/>
@@ -1278,7 +1278,7 @@
                 <w:noProof/>
                 <w:webHidden/>
               </w:rPr>
-              <w:instrText xml:space="preserve"> PAGEREF _Toc227408480 \h </w:instrText>
+              <w:instrText xml:space="preserve"> PAGEREF _Toc228110353 \h </w:instrText>
             </w:r>
             <w:r>
               <w:rPr>
@@ -1325,7 +1325,7 @@
               <w14:ligatures w14:val="standardContextual"/>
             </w:rPr>
           </w:pPr>
-          <w:hyperlink w:anchor="_Toc227408481" w:history="1">
+          <w:hyperlink w:anchor="_Toc228110354" w:history="1">
             <w:r>
               <w:rPr>
                 <w:rStyle w:val="Hiperhivatkozs"/>
@@ -1354,7 +1354,7 @@
                 <w:noProof/>
                 <w:webHidden/>
               </w:rPr>
-              <w:instrText xml:space="preserve"> PAGEREF _Toc227408481 \h </w:instrText>
+              <w:instrText xml:space="preserve"> PAGEREF _Toc228110354 \h </w:instrText>
             </w:r>
             <w:r>
               <w:rPr>
@@ -1401,7 +1401,7 @@
               <w14:ligatures w14:val="standardContextual"/>
             </w:rPr>
           </w:pPr>
-          <w:hyperlink w:anchor="_Toc227408482" w:history="1">
+          <w:hyperlink w:anchor="_Toc228110355" w:history="1">
             <w:r>
               <w:rPr>
                 <w:rStyle w:val="Hiperhivatkozs"/>
@@ -1430,7 +1430,7 @@
                 <w:noProof/>
                 <w:webHidden/>
               </w:rPr>
-              <w:instrText xml:space="preserve"> PAGEREF _Toc227408482 \h </w:instrText>
+              <w:instrText xml:space="preserve"> PAGEREF _Toc228110355 \h </w:instrText>
             </w:r>
             <w:r>
               <w:rPr>
@@ -1477,7 +1477,7 @@
               <w14:ligatures w14:val="standardContextual"/>
             </w:rPr>
           </w:pPr>
-          <w:hyperlink w:anchor="_Toc227408483" w:history="1">
+          <w:hyperlink w:anchor="_Toc228110356" w:history="1">
             <w:r>
               <w:rPr>
                 <w:rStyle w:val="Hiperhivatkozs"/>
@@ -1506,7 +1506,7 @@
                 <w:noProof/>
                 <w:webHidden/>
               </w:rPr>
-              <w:instrText xml:space="preserve"> PAGEREF _Toc227408483 \h </w:instrText>
+              <w:instrText xml:space="preserve"> PAGEREF _Toc228110356 \h </w:instrText>
             </w:r>
             <w:r>
               <w:rPr>
@@ -1553,7 +1553,7 @@
               <w14:ligatures w14:val="standardContextual"/>
             </w:rPr>
           </w:pPr>
-          <w:hyperlink w:anchor="_Toc227408484" w:history="1">
+          <w:hyperlink w:anchor="_Toc228110357" w:history="1">
             <w:r>
               <w:rPr>
                 <w:rStyle w:val="Hiperhivatkozs"/>
@@ -1580,7 +1580,7 @@
                 <w:noProof/>
                 <w:webHidden/>
               </w:rPr>
-              <w:instrText xml:space="preserve"> PAGEREF _Toc227408484 \h </w:instrText>
+              <w:instrText xml:space="preserve"> PAGEREF _Toc228110357 \h </w:instrText>
             </w:r>
             <w:r>
               <w:rPr>
@@ -1627,7 +1627,7 @@
               <w14:ligatures w14:val="standardContextual"/>
             </w:rPr>
           </w:pPr>
-          <w:hyperlink w:anchor="_Toc227408485" w:history="1">
+          <w:hyperlink w:anchor="_Toc228110358" w:history="1">
             <w:r>
               <w:rPr>
                 <w:rStyle w:val="Hiperhivatkozs"/>
@@ -1654,7 +1654,7 @@
                 <w:noProof/>
                 <w:webHidden/>
               </w:rPr>
-              <w:instrText xml:space="preserve"> PAGEREF _Toc227408485 \h </w:instrText>
+              <w:instrText xml:space="preserve"> PAGEREF _Toc228110358 \h </w:instrText>
             </w:r>
             <w:r>
               <w:rPr>
@@ -1701,7 +1701,7 @@
               <w14:ligatures w14:val="standardContextual"/>
             </w:rPr>
           </w:pPr>
-          <w:hyperlink w:anchor="_Toc227408486" w:history="1">
+          <w:hyperlink w:anchor="_Toc228110359" w:history="1">
             <w:r>
               <w:rPr>
                 <w:rStyle w:val="Hiperhivatkozs"/>
@@ -1728,7 +1728,7 @@
                 <w:noProof/>
                 <w:webHidden/>
               </w:rPr>
-              <w:instrText xml:space="preserve"> PAGEREF _Toc227408486 \h </w:instrText>
+              <w:instrText xml:space="preserve"> PAGEREF _Toc228110359 \h </w:instrText>
             </w:r>
             <w:r>
               <w:rPr>
@@ -1775,7 +1775,7 @@
               <w14:ligatures w14:val="standardContextual"/>
             </w:rPr>
           </w:pPr>
-          <w:hyperlink w:anchor="_Toc227408487" w:history="1">
+          <w:hyperlink w:anchor="_Toc228110360" w:history="1">
             <w:r>
               <w:rPr>
                 <w:rStyle w:val="Hiperhivatkozs"/>
@@ -1802,7 +1802,155 @@
                 <w:noProof/>
                 <w:webHidden/>
               </w:rPr>
-              <w:instrText xml:space="preserve"> PAGEREF _Toc227408487 \h </w:instrText>
+              <w:instrText xml:space="preserve"> PAGEREF _Toc228110360 \h </w:instrText>
+            </w:r>
+            <w:r>
+              <w:rPr>
+                <w:noProof/>
+                <w:webHidden/>
+              </w:rPr>
+            </w:r>
+            <w:r>
+              <w:rPr>
+                <w:noProof/>
+                <w:webHidden/>
+              </w:rPr>
+              <w:fldChar w:fldCharType="separate"/>
+            </w:r>
+            <w:r>
+              <w:rPr>
+                <w:noProof/>
+                <w:webHidden/>
+              </w:rPr>
+              <w:t>24</w:t>
+            </w:r>
+            <w:r>
+              <w:rPr>
+                <w:noProof/>
+                <w:webHidden/>
+              </w:rPr>
+              <w:fldChar w:fldCharType="end"/>
+            </w:r>
+          </w:hyperlink>
+        </w:p>
+        <w:p>
+          <w:pPr>
+            <w:pStyle w:val="TJ3"/>
+            <w:tabs>
+              <w:tab w:val="right" w:leader="dot" w:pos="9019"/>
+            </w:tabs>
+            <w:spacing w:line="240" w:lineRule="auto"/>
+            <w:rPr>
+              <w:rFonts w:asciiTheme="minorHAnsi" w:eastAsiaTheme="minorEastAsia" w:hAnsiTheme="minorHAnsi" w:cstheme="minorBidi"/>
+              <w:noProof/>
+              <w:kern w:val="2"/>
+              <w:szCs w:val="24"/>
+              <w:lang w:val="hu-HU"/>
+              <w14:ligatures w14:val="standardContextual"/>
+            </w:rPr>
+          </w:pPr>
+          <w:hyperlink w:anchor="_Toc228110361" w:history="1">
+            <w:r>
+              <w:rPr>
+                <w:rStyle w:val="Hiperhivatkozs"/>
+                <w:noProof/>
+              </w:rPr>
+              <w:t>0.2 kiadás</w:t>
+            </w:r>
+            <w:r>
+              <w:rPr>
+                <w:noProof/>
+                <w:webHidden/>
+              </w:rPr>
+              <w:tab/>
+            </w:r>
+            <w:r>
+              <w:rPr>
+                <w:noProof/>
+                <w:webHidden/>
+              </w:rPr>
+              <w:fldChar w:fldCharType="begin"/>
+            </w:r>
+            <w:r>
+              <w:rPr>
+                <w:noProof/>
+                <w:webHidden/>
+              </w:rPr>
+              <w:instrText xml:space="preserve"> PAGEREF _Toc228110361 \h </w:instrText>
+            </w:r>
+            <w:r>
+              <w:rPr>
+                <w:noProof/>
+                <w:webHidden/>
+              </w:rPr>
+            </w:r>
+            <w:r>
+              <w:rPr>
+                <w:noProof/>
+                <w:webHidden/>
+              </w:rPr>
+              <w:fldChar w:fldCharType="separate"/>
+            </w:r>
+            <w:r>
+              <w:rPr>
+                <w:noProof/>
+                <w:webHidden/>
+              </w:rPr>
+              <w:t>24</w:t>
+            </w:r>
+            <w:r>
+              <w:rPr>
+                <w:noProof/>
+                <w:webHidden/>
+              </w:rPr>
+              <w:fldChar w:fldCharType="end"/>
+            </w:r>
+          </w:hyperlink>
+        </w:p>
+        <w:p>
+          <w:pPr>
+            <w:pStyle w:val="TJ3"/>
+            <w:tabs>
+              <w:tab w:val="right" w:leader="dot" w:pos="9019"/>
+            </w:tabs>
+            <w:spacing w:line="240" w:lineRule="auto"/>
+            <w:rPr>
+              <w:rFonts w:asciiTheme="minorHAnsi" w:eastAsiaTheme="minorEastAsia" w:hAnsiTheme="minorHAnsi" w:cstheme="minorBidi"/>
+              <w:noProof/>
+              <w:kern w:val="2"/>
+              <w:szCs w:val="24"/>
+              <w:lang w:val="hu-HU"/>
+              <w14:ligatures w14:val="standardContextual"/>
+            </w:rPr>
+          </w:pPr>
+          <w:hyperlink w:anchor="_Toc228110362" w:history="1">
+            <w:r>
+              <w:rPr>
+                <w:rStyle w:val="Hiperhivatkozs"/>
+                <w:noProof/>
+              </w:rPr>
+              <w:t>1.0 kiadás</w:t>
+            </w:r>
+            <w:r>
+              <w:rPr>
+                <w:noProof/>
+                <w:webHidden/>
+              </w:rPr>
+              <w:tab/>
+            </w:r>
+            <w:r>
+              <w:rPr>
+                <w:noProof/>
+                <w:webHidden/>
+              </w:rPr>
+              <w:fldChar w:fldCharType="begin"/>
+            </w:r>
+            <w:r>
+              <w:rPr>
+                <w:noProof/>
+                <w:webHidden/>
+              </w:rPr>
+              <w:instrText xml:space="preserve"> PAGEREF _Toc228110362 \h </w:instrText>
             </w:r>
             <w:r>
               <w:rPr>
@@ -1849,7 +1997,7 @@
               <w14:ligatures w14:val="standardContextual"/>
             </w:rPr>
           </w:pPr>
-          <w:hyperlink w:anchor="_Toc227408488" w:history="1">
+          <w:hyperlink w:anchor="_Toc228110363" w:history="1">
             <w:r>
               <w:rPr>
                 <w:rStyle w:val="Hiperhivatkozs"/>
@@ -1876,7 +2024,7 @@
                 <w:noProof/>
                 <w:webHidden/>
               </w:rPr>
-              <w:instrText xml:space="preserve"> PAGEREF _Toc227408488 \h </w:instrText>
+              <w:instrText xml:space="preserve"> PAGEREF _Toc228110363 \h </w:instrText>
             </w:r>
             <w:r>
               <w:rPr>
@@ -1896,7 +2044,7 @@
                 <w:noProof/>
                 <w:webHidden/>
               </w:rPr>
-              <w:t>25</w:t>
+              <w:t>26</w:t>
             </w:r>
             <w:r>
               <w:rPr>
@@ -1923,7 +2071,7 @@
               <w14:ligatures w14:val="standardContextual"/>
             </w:rPr>
           </w:pPr>
-          <w:hyperlink w:anchor="_Toc227408489" w:history="1">
+          <w:hyperlink w:anchor="_Toc228110364" w:history="1">
             <w:r>
               <w:rPr>
                 <w:rStyle w:val="Hiperhivatkozs"/>
@@ -1950,7 +2098,7 @@
                 <w:noProof/>
                 <w:webHidden/>
               </w:rPr>
-              <w:instrText xml:space="preserve"> PAGEREF _Toc227408489 \h </w:instrText>
+              <w:instrText xml:space="preserve"> PAGEREF _Toc228110364 \h </w:instrText>
             </w:r>
             <w:r>
               <w:rPr>
@@ -1970,7 +2118,7 @@
                 <w:noProof/>
                 <w:webHidden/>
               </w:rPr>
-              <w:t>25</w:t>
+              <w:t>26</w:t>
             </w:r>
             <w:r>
               <w:rPr>
@@ -1997,7 +2145,7 @@
               <w14:ligatures w14:val="standardContextual"/>
             </w:rPr>
           </w:pPr>
-          <w:hyperlink w:anchor="_Toc227408490" w:history="1">
+          <w:hyperlink w:anchor="_Toc228110365" w:history="1">
             <w:r>
               <w:rPr>
                 <w:rStyle w:val="Hiperhivatkozs"/>
@@ -2024,7 +2172,7 @@
                 <w:noProof/>
                 <w:webHidden/>
               </w:rPr>
-              <w:instrText xml:space="preserve"> PAGEREF _Toc227408490 \h </w:instrText>
+              <w:instrText xml:space="preserve"> PAGEREF _Toc228110365 \h </w:instrText>
             </w:r>
             <w:r>
               <w:rPr>
@@ -2044,7 +2192,7 @@
                 <w:noProof/>
                 <w:webHidden/>
               </w:rPr>
-              <w:t>26</w:t>
+              <w:t>27</w:t>
             </w:r>
             <w:r>
               <w:rPr>
@@ -2071,7 +2219,7 @@
               <w14:ligatures w14:val="standardContextual"/>
             </w:rPr>
           </w:pPr>
-          <w:hyperlink w:anchor="_Toc227408491" w:history="1">
+          <w:hyperlink w:anchor="_Toc228110366" w:history="1">
             <w:r>
               <w:rPr>
                 <w:rStyle w:val="Hiperhivatkozs"/>
@@ -2098,7 +2246,7 @@
                 <w:noProof/>
                 <w:webHidden/>
               </w:rPr>
-              <w:instrText xml:space="preserve"> PAGEREF _Toc227408491 \h </w:instrText>
+              <w:instrText xml:space="preserve"> PAGEREF _Toc228110366 \h </w:instrText>
             </w:r>
             <w:r>
               <w:rPr>
@@ -2118,7 +2266,7 @@
                 <w:noProof/>
                 <w:webHidden/>
               </w:rPr>
-              <w:t>26</w:t>
+              <w:t>27</w:t>
             </w:r>
             <w:r>
               <w:rPr>
@@ -2145,7 +2293,7 @@
               <w14:ligatures w14:val="standardContextual"/>
             </w:rPr>
           </w:pPr>
-          <w:hyperlink w:anchor="_Toc227408492" w:history="1">
+          <w:hyperlink w:anchor="_Toc228110367" w:history="1">
             <w:r>
               <w:rPr>
                 <w:rStyle w:val="Hiperhivatkozs"/>
@@ -2172,7 +2320,7 @@
                 <w:noProof/>
                 <w:webHidden/>
               </w:rPr>
-              <w:instrText xml:space="preserve"> PAGEREF _Toc227408492 \h </w:instrText>
+              <w:instrText xml:space="preserve"> PAGEREF _Toc228110367 \h </w:instrText>
             </w:r>
             <w:r>
               <w:rPr>
@@ -2192,7 +2340,7 @@
                 <w:noProof/>
                 <w:webHidden/>
               </w:rPr>
-              <w:t>27</w:t>
+              <w:t>28</w:t>
             </w:r>
             <w:r>
               <w:rPr>
@@ -2240,7 +2388,7 @@
           <w:b w:val="0"/>
         </w:rPr>
       </w:pPr>
-      <w:bookmarkStart w:id="3" w:name="_Toc227408469"/>
+      <w:bookmarkStart w:id="3" w:name="_Toc228110342"/>
       <w:r>
         <w:lastRenderedPageBreak/>
         <w:t>Bevezetés</w:t>
@@ -2378,7 +2526,7 @@
       <w:bookmarkStart w:id="4" w:name="_s6xua4fwztab" w:colFirst="0" w:colLast="0"/>
       <w:bookmarkStart w:id="5" w:name="_vswjjk945sxu" w:colFirst="0" w:colLast="0"/>
       <w:bookmarkStart w:id="6" w:name="_1gw11yikceo9" w:colFirst="0" w:colLast="0"/>
-      <w:bookmarkStart w:id="7" w:name="_Toc227408470"/>
+      <w:bookmarkStart w:id="7" w:name="_Toc228110343"/>
       <w:bookmarkEnd w:id="4"/>
       <w:bookmarkEnd w:id="5"/>
       <w:bookmarkEnd w:id="6"/>
@@ -2404,7 +2552,7 @@
       <w:pPr>
         <w:pStyle w:val="Cmsor2"/>
       </w:pPr>
-      <w:bookmarkStart w:id="8" w:name="_Toc227408471"/>
+      <w:bookmarkStart w:id="8" w:name="_Toc228110344"/>
       <w:r>
         <w:lastRenderedPageBreak/>
         <w:t>Architektúra áttekintés</w:t>
@@ -2480,7 +2628,21 @@
           <w:rFonts w:eastAsia="Times New Roman" w:cs="Times New Roman"/>
           <w:szCs w:val="24"/>
         </w:rPr>
-        <w:t>egy web alkalmazással (React + Vite),</w:t>
+        <w:t>egy web</w:t>
+      </w:r>
+      <w:r>
+        <w:rPr>
+          <w:rFonts w:eastAsia="Times New Roman" w:cs="Times New Roman"/>
+          <w:szCs w:val="24"/>
+        </w:rPr>
+        <w:t xml:space="preserve">oldallal </w:t>
+      </w:r>
+      <w:r>
+        <w:rPr>
+          <w:rFonts w:eastAsia="Times New Roman" w:cs="Times New Roman"/>
+          <w:szCs w:val="24"/>
+        </w:rPr>
+        <w:t>(React + Vite),</w:t>
       </w:r>
     </w:p>
     <w:p>
@@ -2738,7 +2900,7 @@
       <w:pPr>
         <w:pStyle w:val="Cmsor2"/>
       </w:pPr>
-      <w:bookmarkStart w:id="11" w:name="_Toc227408472"/>
+      <w:bookmarkStart w:id="11" w:name="_Toc228110345"/>
       <w:r>
         <w:lastRenderedPageBreak/>
         <w:t>Telepítés</w:t>
@@ -2762,7 +2924,7 @@
         </w:rPr>
       </w:pPr>
       <w:bookmarkStart w:id="12" w:name="_u8u0qoyhjyiz" w:colFirst="0" w:colLast="0"/>
-      <w:bookmarkStart w:id="13" w:name="_Toc227408473"/>
+      <w:bookmarkStart w:id="13" w:name="_Toc228110346"/>
       <w:bookmarkEnd w:id="12"/>
       <w:r>
         <w:rPr>
@@ -3236,7 +3398,21 @@
           <w:rFonts w:eastAsia="Times New Roman" w:cs="Times New Roman"/>
           <w:szCs w:val="24"/>
         </w:rPr>
-        <w:t xml:space="preserve"> fájlt, és be kell állítani benne a backend API és a webalkalmazás elérési útját (</w:t>
+        <w:t xml:space="preserve"> fájlt, és be kell állítani benne a backend API és a </w:t>
+      </w:r>
+      <w:r>
+        <w:rPr>
+          <w:rFonts w:eastAsia="Times New Roman" w:cs="Times New Roman"/>
+          <w:szCs w:val="24"/>
+        </w:rPr>
+        <w:t>weboldal</w:t>
+      </w:r>
+      <w:r>
+        <w:rPr>
+          <w:rFonts w:eastAsia="Times New Roman" w:cs="Times New Roman"/>
+          <w:szCs w:val="24"/>
+        </w:rPr>
+        <w:t xml:space="preserve"> elérési útját (</w:t>
       </w:r>
       <w:r>
         <w:rPr>
@@ -3352,7 +3528,7 @@
       <w:bookmarkEnd w:id="16"/>
       <w:r>
         <w:lastRenderedPageBreak/>
-        <w:t>Webalkalmazás (React/Vite)</w:t>
+        <w:t>Weboldal (React/Vite)</w:t>
       </w:r>
     </w:p>
     <w:p>
@@ -3368,7 +3544,21 @@
           <w:rFonts w:eastAsia="Times New Roman" w:cs="Times New Roman"/>
           <w:szCs w:val="24"/>
         </w:rPr>
-        <w:t xml:space="preserve">A webalkalmazás esetében a </w:t>
+        <w:t xml:space="preserve">A </w:t>
+      </w:r>
+      <w:r>
+        <w:rPr>
+          <w:rFonts w:eastAsia="Times New Roman" w:cs="Times New Roman"/>
+          <w:szCs w:val="24"/>
+        </w:rPr>
+        <w:t>weboldal</w:t>
+      </w:r>
+      <w:r>
+        <w:rPr>
+          <w:rFonts w:eastAsia="Times New Roman" w:cs="Times New Roman"/>
+          <w:szCs w:val="24"/>
+        </w:rPr>
+        <w:t xml:space="preserve"> esetében a </w:t>
       </w:r>
       <w:r>
         <w:rPr>
@@ -3683,7 +3873,7 @@
         <w:pStyle w:val="Cmsor3"/>
       </w:pPr>
       <w:bookmarkStart w:id="18" w:name="_35qpvs3stm9z" w:colFirst="0" w:colLast="0"/>
-      <w:bookmarkStart w:id="19" w:name="_Toc227408474"/>
+      <w:bookmarkStart w:id="19" w:name="_Toc228110347"/>
       <w:bookmarkEnd w:id="18"/>
       <w:r>
         <w:t>Konfiguráció</w:t>
@@ -3942,7 +4132,21 @@
           <w:rFonts w:eastAsia="Times New Roman" w:cs="Times New Roman"/>
           <w:szCs w:val="24"/>
         </w:rPr>
-        <w:t>: A webalkalmazás elérési útja</w:t>
+        <w:t xml:space="preserve">: A </w:t>
+      </w:r>
+      <w:r>
+        <w:rPr>
+          <w:rFonts w:eastAsia="Times New Roman" w:cs="Times New Roman"/>
+          <w:szCs w:val="24"/>
+        </w:rPr>
+        <w:t>weboldal</w:t>
+      </w:r>
+      <w:r>
+        <w:rPr>
+          <w:rFonts w:eastAsia="Times New Roman" w:cs="Times New Roman"/>
+          <w:szCs w:val="24"/>
+        </w:rPr>
+        <w:t xml:space="preserve"> elérési útja</w:t>
       </w:r>
     </w:p>
     <w:p>
@@ -3952,7 +4156,7 @@
       <w:bookmarkStart w:id="23" w:name="_gra6kxa4n4l7" w:colFirst="0" w:colLast="0"/>
       <w:bookmarkEnd w:id="23"/>
       <w:r>
-        <w:t>Webalkalmazás</w:t>
+        <w:t>Weboldal</w:t>
       </w:r>
     </w:p>
     <w:p>
@@ -3968,7 +4172,21 @@
           <w:rFonts w:eastAsia="Times New Roman" w:cs="Times New Roman"/>
           <w:szCs w:val="24"/>
         </w:rPr>
-        <w:t>A webalkalmazás konfigurációja a backend API elérhetőségére korlátozódik.</w:t>
+        <w:t xml:space="preserve">A </w:t>
+      </w:r>
+      <w:r>
+        <w:rPr>
+          <w:rFonts w:eastAsia="Times New Roman" w:cs="Times New Roman"/>
+          <w:szCs w:val="24"/>
+        </w:rPr>
+        <w:t>weboldal</w:t>
+      </w:r>
+      <w:r>
+        <w:rPr>
+          <w:rFonts w:eastAsia="Times New Roman" w:cs="Times New Roman"/>
+          <w:szCs w:val="24"/>
+        </w:rPr>
+        <w:t xml:space="preserve"> konfigurációja a backend API elérhetőségére korlátozódik.</w:t>
       </w:r>
     </w:p>
     <w:p>
@@ -4110,8 +4328,8 @@
       </w:pPr>
       <w:bookmarkStart w:id="25" w:name="_nhv3kjoxcuef" w:colFirst="0" w:colLast="0"/>
       <w:bookmarkStart w:id="26" w:name="_xkhrf2qcrxzs" w:colFirst="0" w:colLast="0"/>
-      <w:bookmarkStart w:id="27" w:name="_Toc227408475"/>
-      <w:bookmarkStart w:id="28" w:name="_Hlk227407387"/>
+      <w:bookmarkStart w:id="27" w:name="_Hlk227407387"/>
+      <w:bookmarkStart w:id="28" w:name="_Toc228110348"/>
       <w:bookmarkEnd w:id="25"/>
       <w:bookmarkEnd w:id="26"/>
       <w:r>
@@ -4137,13 +4355,13 @@
         </w:rPr>
         <w:t>leírás</w:t>
       </w:r>
-      <w:bookmarkEnd w:id="27"/>
+      <w:bookmarkEnd w:id="28"/>
     </w:p>
     <w:p>
       <w:pPr>
         <w:pStyle w:val="Cmsor3"/>
       </w:pPr>
-      <w:bookmarkStart w:id="31" w:name="_Toc227408476"/>
+      <w:bookmarkStart w:id="31" w:name="_Toc228110349"/>
       <w:r>
         <w:t>DBMS (</w:t>
       </w:r>
@@ -4319,7 +4537,7 @@
       <w:pPr>
         <w:pStyle w:val="Cmsor3"/>
       </w:pPr>
-      <w:bookmarkStart w:id="32" w:name="_Toc227408477"/>
+      <w:bookmarkStart w:id="32" w:name="_Toc228110350"/>
       <w:r>
         <w:t>Táblák</w:t>
       </w:r>
@@ -5752,15 +5970,6 @@
           <w:szCs w:val="24"/>
         </w:rPr>
       </w:pPr>
-    </w:p>
-    <w:p>
-      <w:pPr>
-        <w:rPr>
-          <w:rFonts w:eastAsia="Times New Roman" w:cs="Times New Roman"/>
-          <w:color w:val="188038"/>
-          <w:szCs w:val="24"/>
-        </w:rPr>
-      </w:pPr>
       <w:r>
         <w:rPr>
           <w:rFonts w:eastAsia="Times New Roman" w:cs="Times New Roman"/>
@@ -6304,7 +6513,6 @@
           <w:color w:val="188038"/>
           <w:szCs w:val="24"/>
         </w:rPr>
-        <w:lastRenderedPageBreak/>
         <w:t>);</w:t>
       </w:r>
     </w:p>
@@ -6316,6 +6524,7 @@
       <w:bookmarkEnd w:id="38"/>
       <w:proofErr w:type="spellStart"/>
       <w:r>
+        <w:lastRenderedPageBreak/>
         <w:t>plans</w:t>
       </w:r>
       <w:proofErr w:type="spellEnd"/>
@@ -7119,27 +7328,17 @@
           <w:rFonts w:eastAsia="Times New Roman" w:cs="Times New Roman"/>
           <w:color w:val="188038"/>
           <w:szCs w:val="24"/>
+        </w:rPr>
+      </w:pPr>
+      <w:r>
+        <w:rPr>
+          <w:rFonts w:eastAsia="Times New Roman" w:cs="Times New Roman"/>
+          <w:color w:val="188038"/>
+          <w:szCs w:val="24"/>
           <w:lang w:val="hu-HU"/>
         </w:rPr>
-      </w:pPr>
-      <w:r>
-        <w:rPr>
-          <w:rFonts w:eastAsia="Times New Roman" w:cs="Times New Roman"/>
-          <w:color w:val="188038"/>
-          <w:szCs w:val="24"/>
-          <w:lang w:val="hu-HU"/>
-        </w:rPr>
         <w:t>   )</w:t>
       </w:r>
-    </w:p>
-    <w:p>
-      <w:pPr>
-        <w:rPr>
-          <w:rFonts w:eastAsia="Times New Roman" w:cs="Times New Roman"/>
-          <w:color w:val="188038"/>
-          <w:szCs w:val="24"/>
-        </w:rPr>
-      </w:pPr>
     </w:p>
     <w:p>
       <w:pPr>
@@ -7166,7 +7365,6 @@
       <w:bookmarkEnd w:id="40"/>
       <w:proofErr w:type="spellStart"/>
       <w:r>
-        <w:lastRenderedPageBreak/>
         <w:t>codes</w:t>
       </w:r>
       <w:proofErr w:type="spellEnd"/>
@@ -7877,7 +8075,7 @@
       <w:pPr>
         <w:pStyle w:val="Cmsor3"/>
       </w:pPr>
-      <w:bookmarkStart w:id="42" w:name="_Toc227408478"/>
+      <w:bookmarkStart w:id="42" w:name="_Toc228110351"/>
       <w:r>
         <w:t>Normálformák</w:t>
       </w:r>
@@ -8146,7 +8344,7 @@
       <w:pPr>
         <w:pStyle w:val="Cmsor3"/>
       </w:pPr>
-      <w:bookmarkStart w:id="43" w:name="_Toc227408479"/>
+      <w:bookmarkStart w:id="43" w:name="_Toc228110352"/>
       <w:r>
         <w:t>E-R diagram</w:t>
       </w:r>
@@ -8234,8 +8432,8 @@
       <w:pPr>
         <w:pStyle w:val="Cmsor2"/>
       </w:pPr>
-      <w:bookmarkStart w:id="44" w:name="_Toc227408480"/>
-      <w:bookmarkEnd w:id="28"/>
+      <w:bookmarkStart w:id="44" w:name="_Toc228110353"/>
+      <w:bookmarkEnd w:id="27"/>
       <w:r>
         <w:lastRenderedPageBreak/>
         <w:t>API dokumentáció</w:t>
@@ -8256,7 +8454,7 @@
         </w:rPr>
       </w:pPr>
       <w:bookmarkStart w:id="45" w:name="_dn6y8wxsuvuf" w:colFirst="0" w:colLast="0"/>
-      <w:bookmarkStart w:id="46" w:name="_Toc227408481"/>
+      <w:bookmarkStart w:id="46" w:name="_Toc228110354"/>
       <w:bookmarkEnd w:id="45"/>
       <w:r>
         <w:rPr>
@@ -8297,7 +8495,7 @@
         </w:rPr>
       </w:pPr>
       <w:bookmarkStart w:id="47" w:name="_d51w6wtpaiv1" w:colFirst="0" w:colLast="0"/>
-      <w:bookmarkStart w:id="48" w:name="_Toc227408482"/>
+      <w:bookmarkStart w:id="48" w:name="_Toc228110355"/>
       <w:bookmarkEnd w:id="47"/>
       <w:r>
         <w:rPr>
@@ -8417,7 +8615,7 @@
         </w:rPr>
       </w:pPr>
       <w:bookmarkStart w:id="49" w:name="_uz2bp9515jlv" w:colFirst="0" w:colLast="0"/>
-      <w:bookmarkStart w:id="50" w:name="_Toc227408483"/>
+      <w:bookmarkStart w:id="50" w:name="_Toc228110356"/>
       <w:bookmarkEnd w:id="49"/>
       <w:r>
         <w:rPr>
@@ -13886,7 +14084,7 @@
       <w:pPr>
         <w:pStyle w:val="Cmsor2"/>
       </w:pPr>
-      <w:bookmarkStart w:id="59" w:name="_Toc227408484"/>
+      <w:bookmarkStart w:id="59" w:name="_Toc228110357"/>
       <w:r>
         <w:lastRenderedPageBreak/>
         <w:t>Teszt dokumentáció</w:t>
@@ -13897,7 +14095,7 @@
       <w:pPr>
         <w:pStyle w:val="Cmsor3"/>
       </w:pPr>
-      <w:bookmarkStart w:id="60" w:name="_Toc227408485"/>
+      <w:bookmarkStart w:id="60" w:name="_Toc228110358"/>
       <w:r>
         <w:t>Tesztelési felhasználó adatai</w:t>
       </w:r>
@@ -13977,7 +14175,7 @@
       <w:pPr>
         <w:pStyle w:val="Cmsor3"/>
       </w:pPr>
-      <w:bookmarkStart w:id="61" w:name="_Toc227408486"/>
+      <w:bookmarkStart w:id="61" w:name="_Toc228110359"/>
       <w:r>
         <w:t>Funkcionális tesztek</w:t>
       </w:r>
@@ -17194,7 +17392,7 @@
       <w:pPr>
         <w:pStyle w:val="Cmsor2"/>
       </w:pPr>
-      <w:bookmarkStart w:id="69" w:name="_Toc227408487"/>
+      <w:bookmarkStart w:id="69" w:name="_Toc228110360"/>
       <w:r>
         <w:lastRenderedPageBreak/>
         <w:t>Tervezett fejlesztések</w:t>
@@ -17205,9 +17403,11 @@
       <w:pPr>
         <w:pStyle w:val="Cmsor3"/>
       </w:pPr>
+      <w:bookmarkStart w:id="70" w:name="_Toc228110361"/>
       <w:r>
         <w:t>0.2 kiadás</w:t>
       </w:r>
+      <w:bookmarkEnd w:id="70"/>
     </w:p>
     <w:p>
       <w:pPr>
@@ -17265,9 +17465,11 @@
       <w:pPr>
         <w:pStyle w:val="Cmsor3"/>
       </w:pPr>
+      <w:bookmarkStart w:id="71" w:name="_Toc228110362"/>
       <w:r>
         <w:t>1.0 kiadás</w:t>
       </w:r>
+      <w:bookmarkEnd w:id="71"/>
     </w:p>
     <w:p>
       <w:pPr>
@@ -17583,10 +17785,10 @@
         </w:rPr>
         <w:t>Személyes rekordok (PR) megjelenítése gyakorlatonként</w:t>
       </w:r>
-      <w:bookmarkStart w:id="70" w:name="_ywmmk0why0zi" w:colFirst="0" w:colLast="0"/>
-      <w:bookmarkStart w:id="71" w:name="_bbmes8ddnj4" w:colFirst="0" w:colLast="0"/>
-      <w:bookmarkEnd w:id="70"/>
-      <w:bookmarkEnd w:id="71"/>
+      <w:bookmarkStart w:id="72" w:name="_ywmmk0why0zi" w:colFirst="0" w:colLast="0"/>
+      <w:bookmarkStart w:id="73" w:name="_bbmes8ddnj4" w:colFirst="0" w:colLast="0"/>
+      <w:bookmarkEnd w:id="72"/>
+      <w:bookmarkEnd w:id="73"/>
     </w:p>
     <w:p>
       <w:pPr>
@@ -17607,12 +17809,12 @@
       <w:pPr>
         <w:pStyle w:val="Cmsor1"/>
       </w:pPr>
-      <w:bookmarkStart w:id="72" w:name="_Toc227408488"/>
+      <w:bookmarkStart w:id="74" w:name="_Toc228110363"/>
       <w:r>
         <w:lastRenderedPageBreak/>
         <w:t>Felhasználói dokumentáció</w:t>
       </w:r>
-      <w:bookmarkEnd w:id="72"/>
+      <w:bookmarkEnd w:id="74"/>
     </w:p>
     <w:p>
       <w:pPr>
@@ -17650,11 +17852,11 @@
       <w:pPr>
         <w:pStyle w:val="Cmsor2"/>
       </w:pPr>
-      <w:bookmarkStart w:id="73" w:name="_Toc227408489"/>
+      <w:bookmarkStart w:id="75" w:name="_Toc228110364"/>
       <w:r>
         <w:t>Alapvető felhasználói funkciók</w:t>
       </w:r>
-      <w:bookmarkEnd w:id="73"/>
+      <w:bookmarkEnd w:id="75"/>
     </w:p>
     <w:p>
       <w:pPr>
@@ -17944,19 +18146,19 @@
       <w:pPr>
         <w:pStyle w:val="Cmsor2"/>
       </w:pPr>
-      <w:bookmarkStart w:id="74" w:name="_Toc227408490"/>
+      <w:bookmarkStart w:id="76" w:name="_Toc228110365"/>
       <w:r>
         <w:lastRenderedPageBreak/>
         <w:t>Célfelhasználók</w:t>
       </w:r>
-      <w:bookmarkEnd w:id="74"/>
+      <w:bookmarkEnd w:id="76"/>
     </w:p>
     <w:p>
       <w:pPr>
         <w:pStyle w:val="Cmsor4"/>
       </w:pPr>
-      <w:bookmarkStart w:id="75" w:name="_oeyol87aa881" w:colFirst="0" w:colLast="0"/>
-      <w:bookmarkEnd w:id="75"/>
+      <w:bookmarkStart w:id="77" w:name="_oeyol87aa881" w:colFirst="0" w:colLast="0"/>
+      <w:bookmarkEnd w:id="77"/>
       <w:proofErr w:type="spellStart"/>
       <w:r>
         <w:t>Fitness</w:t>
@@ -18059,18 +18261,18 @@
       <w:pPr>
         <w:pStyle w:val="Cmsor2"/>
       </w:pPr>
-      <w:bookmarkStart w:id="76" w:name="_Toc227408491"/>
+      <w:bookmarkStart w:id="78" w:name="_Toc228110366"/>
       <w:r>
         <w:t>Fő használati esetek</w:t>
       </w:r>
-      <w:bookmarkEnd w:id="76"/>
+      <w:bookmarkEnd w:id="78"/>
     </w:p>
     <w:p>
       <w:pPr>
         <w:pStyle w:val="Cmsor4"/>
       </w:pPr>
-      <w:bookmarkStart w:id="77" w:name="_tfo2kfay0955" w:colFirst="0" w:colLast="0"/>
-      <w:bookmarkEnd w:id="77"/>
+      <w:bookmarkStart w:id="79" w:name="_tfo2kfay0955" w:colFirst="0" w:colLast="0"/>
+      <w:bookmarkEnd w:id="79"/>
       <w:r>
         <w:t>Edzésterv létrehozása</w:t>
       </w:r>
@@ -18176,8 +18378,8 @@
       <w:pPr>
         <w:pStyle w:val="Cmsor4"/>
       </w:pPr>
-      <w:bookmarkStart w:id="78" w:name="_4k5vztwmznce" w:colFirst="0" w:colLast="0"/>
-      <w:bookmarkEnd w:id="78"/>
+      <w:bookmarkStart w:id="80" w:name="_4k5vztwmznce" w:colFirst="0" w:colLast="0"/>
+      <w:bookmarkEnd w:id="80"/>
       <w:r>
         <w:t xml:space="preserve">Edzés </w:t>
       </w:r>
@@ -18248,8 +18450,8 @@
       <w:pPr>
         <w:pStyle w:val="Cmsor4"/>
       </w:pPr>
-      <w:bookmarkStart w:id="79" w:name="_4ewkqtablook" w:colFirst="0" w:colLast="0"/>
-      <w:bookmarkEnd w:id="79"/>
+      <w:bookmarkStart w:id="81" w:name="_4ewkqtablook" w:colFirst="0" w:colLast="0"/>
+      <w:bookmarkEnd w:id="81"/>
       <w:r>
         <w:t>Előző edzések megtekintése</w:t>
       </w:r>
@@ -18293,8 +18495,8 @@
         </w:rPr>
         <w:t>Kiválaszt egy előző edzést a korábbi edzésekből, vagy egy pontos dátumot a naptárból</w:t>
       </w:r>
-      <w:bookmarkStart w:id="80" w:name="_ljuq7k35m1iu" w:colFirst="0" w:colLast="0"/>
-      <w:bookmarkEnd w:id="80"/>
+      <w:bookmarkStart w:id="82" w:name="_ljuq7k35m1iu" w:colFirst="0" w:colLast="0"/>
+      <w:bookmarkEnd w:id="82"/>
     </w:p>
     <w:p>
       <w:pPr>
@@ -18315,12 +18517,12 @@
       <w:pPr>
         <w:pStyle w:val="Cmsor1"/>
       </w:pPr>
-      <w:bookmarkStart w:id="81" w:name="_Toc227408492"/>
+      <w:bookmarkStart w:id="83" w:name="_Toc228110367"/>
       <w:r>
         <w:lastRenderedPageBreak/>
         <w:t>Irodalomjegyzék</w:t>
       </w:r>
-      <w:bookmarkEnd w:id="81"/>
+      <w:bookmarkEnd w:id="83"/>
     </w:p>
     <w:p>
       <w:pPr>
@@ -18532,7 +18734,9 @@
       <w:pPr>
         <w:rPr>
           <w:rFonts w:eastAsia="Times New Roman" w:cs="Times New Roman"/>
-          <w:szCs w:val="24"/>
+          <w:color w:val="1155CC"/>
+          <w:szCs w:val="24"/>
+          <w:u w:val="single"/>
         </w:rPr>
       </w:pPr>
       <w:hyperlink r:id="rId12">
@@ -18547,8 +18751,101 @@
         </w:r>
       </w:hyperlink>
     </w:p>
+    <w:p>
+      <w:pPr>
+        <w:rPr>
+          <w:rFonts w:eastAsia="Times New Roman" w:cs="Times New Roman"/>
+          <w:b/>
+          <w:bCs/>
+          <w:szCs w:val="24"/>
+        </w:rPr>
+      </w:pPr>
+      <w:r>
+        <w:rPr>
+          <w:rFonts w:eastAsia="Times New Roman" w:cs="Times New Roman"/>
+          <w:b/>
+          <w:bCs/>
+          <w:szCs w:val="24"/>
+        </w:rPr>
+        <w:t xml:space="preserve">Node.js Express és </w:t>
+      </w:r>
+      <w:proofErr w:type="spellStart"/>
+      <w:r>
+        <w:rPr>
+          <w:rFonts w:eastAsia="Times New Roman" w:cs="Times New Roman"/>
+          <w:b/>
+          <w:bCs/>
+          <w:szCs w:val="24"/>
+        </w:rPr>
+        <w:t>SQLite</w:t>
+      </w:r>
+      <w:proofErr w:type="spellEnd"/>
+      <w:r>
+        <w:rPr>
+          <w:rFonts w:eastAsia="Times New Roman" w:cs="Times New Roman"/>
+          <w:b/>
+          <w:bCs/>
+          <w:szCs w:val="24"/>
+        </w:rPr>
+        <w:t xml:space="preserve"> alapok</w:t>
+      </w:r>
+    </w:p>
+    <w:p>
+      <w:pPr>
+        <w:rPr>
+          <w:rFonts w:eastAsia="Times New Roman" w:cs="Times New Roman"/>
+          <w:color w:val="1155CC"/>
+          <w:szCs w:val="24"/>
+          <w:u w:val="single"/>
+        </w:rPr>
+      </w:pPr>
+      <w:hyperlink r:id="rId13" w:history="1">
+        <w:r>
+          <w:rPr>
+            <w:color w:val="1155CC"/>
+            <w:u w:val="single"/>
+          </w:rPr>
+          <w:t>https://medium.com/@gauravupadhyay786.gu/building-a-simple-crud-api-in-node-js-and-express-using-sqlite-</w:t>
+        </w:r>
+        <w:r>
+          <w:rPr>
+            <w:rFonts w:eastAsia="Times New Roman" w:cs="Times New Roman"/>
+            <w:color w:val="1155CC"/>
+            <w:szCs w:val="24"/>
+            <w:u w:val="single"/>
+          </w:rPr>
+          <w:t>a596a43</w:t>
+        </w:r>
+        <w:r>
+          <w:rPr>
+            <w:rFonts w:eastAsia="Times New Roman" w:cs="Times New Roman"/>
+            <w:color w:val="1155CC"/>
+            <w:szCs w:val="24"/>
+            <w:u w:val="single"/>
+          </w:rPr>
+          <w:t>c</w:t>
+        </w:r>
+        <w:r>
+          <w:rPr>
+            <w:rFonts w:eastAsia="Times New Roman" w:cs="Times New Roman"/>
+            <w:color w:val="1155CC"/>
+            <w:szCs w:val="24"/>
+            <w:u w:val="single"/>
+          </w:rPr>
+          <w:t>9ab9</w:t>
+        </w:r>
+      </w:hyperlink>
+    </w:p>
+    <w:p>
+      <w:pPr>
+        <w:rPr>
+          <w:rFonts w:eastAsia="Times New Roman" w:cs="Times New Roman"/>
+          <w:szCs w:val="24"/>
+        </w:rPr>
+      </w:pPr>
+    </w:p>
     <w:sectPr>
-      <w:footerReference w:type="default" r:id="rId13"/>
+      <w:footerReference w:type="default" r:id="rId14"/>
       <w:pgSz w:w="11909" w:h="16834"/>
       <w:pgMar w:top="1440" w:right="1440" w:bottom="1440" w:left="1440" w:header="720" w:footer="720" w:gutter="0"/>
       <w:pgNumType w:start="1"/>
@@ -22421,6 +22718,18 @@
     <w:uiPriority w:val="99"/>
     <w:rsid w:val="009455AC"/>
   </w:style>
+  <w:style w:type="character" w:styleId="Feloldatlanmegemlts">
+    <w:name w:val="Unresolved Mention"/>
+    <w:basedOn w:val="Bekezdsalapbettpusa"/>
+    <w:uiPriority w:val="99"/>
+    <w:semiHidden/>
+    <w:unhideWhenUsed/>
+    <w:rsid w:val="005A055E"/>
+    <w:rPr>
+      <w:color w:val="605E5C"/>
+      <w:shd w:val="clear" w:color="auto" w:fill="E1DFDD"/>
+    </w:rPr>
+  </w:style>
 </w:styles>
 </file>
 

</xml_diff>

<commit_message>
fix: update Hungarian documentation with corrected table of contents and API endpoint methods
</commit_message>
<xml_diff>
--- a/documents/Documentation_MaxxedOut-HU.docx
+++ b/documents/Documentation_MaxxedOut-HU.docx
@@ -469,7 +469,7 @@
                 <w:noProof/>
                 <w:webHidden/>
               </w:rPr>
-              <w:t>4</w:t>
+              <w:t>3</w:t>
             </w:r>
             <w:r>
               <w:rPr>
@@ -539,7 +539,7 @@
                 <w:noProof/>
                 <w:webHidden/>
               </w:rPr>
-              <w:t>5</w:t>
+              <w:t>4</w:t>
             </w:r>
             <w:r>
               <w:rPr>
@@ -613,7 +613,7 @@
                 <w:noProof/>
                 <w:webHidden/>
               </w:rPr>
-              <w:t>5</w:t>
+              <w:t>4</w:t>
             </w:r>
             <w:r>
               <w:rPr>
@@ -687,7 +687,7 @@
                 <w:noProof/>
                 <w:webHidden/>
               </w:rPr>
-              <w:t>6</w:t>
+              <w:t>5</w:t>
             </w:r>
             <w:r>
               <w:rPr>
@@ -701,10 +701,6 @@
         <w:p>
           <w:pPr>
             <w:pStyle w:val="TJ3"/>
-            <w:tabs>
-              <w:tab w:val="right" w:leader="dot" w:pos="9019"/>
-            </w:tabs>
-            <w:spacing w:line="240" w:lineRule="auto"/>
             <w:rPr>
               <w:rFonts w:asciiTheme="minorHAnsi" w:eastAsiaTheme="minorEastAsia" w:hAnsiTheme="minorHAnsi" w:cstheme="minorBidi"/>
               <w:noProof/>
@@ -763,7 +759,7 @@
                 <w:noProof/>
                 <w:webHidden/>
               </w:rPr>
-              <w:t>6</w:t>
+              <w:t>5</w:t>
             </w:r>
             <w:r>
               <w:rPr>
@@ -777,10 +773,6 @@
         <w:p>
           <w:pPr>
             <w:pStyle w:val="TJ3"/>
-            <w:tabs>
-              <w:tab w:val="right" w:leader="dot" w:pos="9019"/>
-            </w:tabs>
-            <w:spacing w:line="240" w:lineRule="auto"/>
             <w:rPr>
               <w:rFonts w:asciiTheme="minorHAnsi" w:eastAsiaTheme="minorEastAsia" w:hAnsiTheme="minorHAnsi" w:cstheme="minorBidi"/>
               <w:noProof/>
@@ -796,21 +788,7 @@
                 <w:rStyle w:val="Hiperhivatkozs"/>
                 <w:noProof/>
               </w:rPr>
-              <w:t>Ko</w:t>
-            </w:r>
-            <w:r>
-              <w:rPr>
-                <w:rStyle w:val="Hiperhivatkozs"/>
-                <w:noProof/>
-              </w:rPr>
-              <w:t>n</w:t>
-            </w:r>
-            <w:r>
-              <w:rPr>
-                <w:rStyle w:val="Hiperhivatkozs"/>
-                <w:noProof/>
-              </w:rPr>
-              <w:t>figuráció</w:t>
+              <w:t>Konfiguráció</w:t>
             </w:r>
             <w:r>
               <w:rPr>
@@ -851,7 +829,7 @@
                 <w:noProof/>
                 <w:webHidden/>
               </w:rPr>
-              <w:t>7</w:t>
+              <w:t>6</w:t>
             </w:r>
             <w:r>
               <w:rPr>
@@ -927,7 +905,7 @@
                 <w:noProof/>
                 <w:webHidden/>
               </w:rPr>
-              <w:t>9</w:t>
+              <w:t>8</w:t>
             </w:r>
             <w:r>
               <w:rPr>
@@ -941,10 +919,6 @@
         <w:p>
           <w:pPr>
             <w:pStyle w:val="TJ3"/>
-            <w:tabs>
-              <w:tab w:val="right" w:leader="dot" w:pos="9019"/>
-            </w:tabs>
-            <w:spacing w:line="240" w:lineRule="auto"/>
             <w:rPr>
               <w:rFonts w:asciiTheme="minorHAnsi" w:eastAsiaTheme="minorEastAsia" w:hAnsiTheme="minorHAnsi" w:cstheme="minorBidi"/>
               <w:noProof/>
@@ -1001,7 +975,7 @@
                 <w:noProof/>
                 <w:webHidden/>
               </w:rPr>
-              <w:t>9</w:t>
+              <w:t>8</w:t>
             </w:r>
             <w:r>
               <w:rPr>
@@ -1015,10 +989,6 @@
         <w:p>
           <w:pPr>
             <w:pStyle w:val="TJ3"/>
-            <w:tabs>
-              <w:tab w:val="right" w:leader="dot" w:pos="9019"/>
-            </w:tabs>
-            <w:spacing w:line="240" w:lineRule="auto"/>
             <w:rPr>
               <w:rFonts w:asciiTheme="minorHAnsi" w:eastAsiaTheme="minorEastAsia" w:hAnsiTheme="minorHAnsi" w:cstheme="minorBidi"/>
               <w:noProof/>
@@ -1075,7 +1045,7 @@
                 <w:noProof/>
                 <w:webHidden/>
               </w:rPr>
-              <w:t>9</w:t>
+              <w:t>8</w:t>
             </w:r>
             <w:r>
               <w:rPr>
@@ -1089,10 +1059,6 @@
         <w:p>
           <w:pPr>
             <w:pStyle w:val="TJ3"/>
-            <w:tabs>
-              <w:tab w:val="right" w:leader="dot" w:pos="9019"/>
-            </w:tabs>
-            <w:spacing w:line="240" w:lineRule="auto"/>
             <w:rPr>
               <w:rFonts w:asciiTheme="minorHAnsi" w:eastAsiaTheme="minorEastAsia" w:hAnsiTheme="minorHAnsi" w:cstheme="minorBidi"/>
               <w:noProof/>
@@ -1149,7 +1115,7 @@
                 <w:noProof/>
                 <w:webHidden/>
               </w:rPr>
-              <w:t>14</w:t>
+              <w:t>13</w:t>
             </w:r>
             <w:r>
               <w:rPr>
@@ -1163,10 +1129,6 @@
         <w:p>
           <w:pPr>
             <w:pStyle w:val="TJ3"/>
-            <w:tabs>
-              <w:tab w:val="right" w:leader="dot" w:pos="9019"/>
-            </w:tabs>
-            <w:spacing w:line="240" w:lineRule="auto"/>
             <w:rPr>
               <w:rFonts w:asciiTheme="minorHAnsi" w:eastAsiaTheme="minorEastAsia" w:hAnsiTheme="minorHAnsi" w:cstheme="minorBidi"/>
               <w:noProof/>
@@ -1223,7 +1185,7 @@
                 <w:noProof/>
                 <w:webHidden/>
               </w:rPr>
-              <w:t>15</w:t>
+              <w:t>14</w:t>
             </w:r>
             <w:r>
               <w:rPr>
@@ -1297,7 +1259,7 @@
                 <w:noProof/>
                 <w:webHidden/>
               </w:rPr>
-              <w:t>16</w:t>
+              <w:t>15</w:t>
             </w:r>
             <w:r>
               <w:rPr>
@@ -1311,10 +1273,6 @@
         <w:p>
           <w:pPr>
             <w:pStyle w:val="TJ3"/>
-            <w:tabs>
-              <w:tab w:val="right" w:leader="dot" w:pos="9019"/>
-            </w:tabs>
-            <w:spacing w:line="240" w:lineRule="auto"/>
             <w:rPr>
               <w:rFonts w:asciiTheme="minorHAnsi" w:eastAsiaTheme="minorEastAsia" w:hAnsiTheme="minorHAnsi" w:cstheme="minorBidi"/>
               <w:noProof/>
@@ -1332,25 +1290,7 @@
                 <w:bCs/>
                 <w:noProof/>
               </w:rPr>
-              <w:t>Al</w:t>
-            </w:r>
-            <w:r>
-              <w:rPr>
-                <w:rStyle w:val="Hiperhivatkozs"/>
-                <w:rFonts w:eastAsia="Times New Roman" w:cs="Times New Roman"/>
-                <w:bCs/>
-                <w:noProof/>
-              </w:rPr>
-              <w:t>a</w:t>
-            </w:r>
-            <w:r>
-              <w:rPr>
-                <w:rStyle w:val="Hiperhivatkozs"/>
-                <w:rFonts w:eastAsia="Times New Roman" w:cs="Times New Roman"/>
-                <w:bCs/>
-                <w:noProof/>
-              </w:rPr>
-              <w:t>p URL</w:t>
+              <w:t>Alap URL</w:t>
             </w:r>
             <w:r>
               <w:rPr>
@@ -1391,7 +1331,7 @@
                 <w:noProof/>
                 <w:webHidden/>
               </w:rPr>
-              <w:t>16</w:t>
+              <w:t>15</w:t>
             </w:r>
             <w:r>
               <w:rPr>
@@ -1405,10 +1345,6 @@
         <w:p>
           <w:pPr>
             <w:pStyle w:val="TJ3"/>
-            <w:tabs>
-              <w:tab w:val="right" w:leader="dot" w:pos="9019"/>
-            </w:tabs>
-            <w:spacing w:line="240" w:lineRule="auto"/>
             <w:rPr>
               <w:rFonts w:asciiTheme="minorHAnsi" w:eastAsiaTheme="minorEastAsia" w:hAnsiTheme="minorHAnsi" w:cstheme="minorBidi"/>
               <w:noProof/>
@@ -1467,7 +1403,7 @@
                 <w:noProof/>
                 <w:webHidden/>
               </w:rPr>
-              <w:t>16</w:t>
+              <w:t>15</w:t>
             </w:r>
             <w:r>
               <w:rPr>
@@ -1481,10 +1417,6 @@
         <w:p>
           <w:pPr>
             <w:pStyle w:val="TJ3"/>
-            <w:tabs>
-              <w:tab w:val="right" w:leader="dot" w:pos="9019"/>
-            </w:tabs>
-            <w:spacing w:line="240" w:lineRule="auto"/>
             <w:rPr>
               <w:rFonts w:asciiTheme="minorHAnsi" w:eastAsiaTheme="minorEastAsia" w:hAnsiTheme="minorHAnsi" w:cstheme="minorBidi"/>
               <w:noProof/>
@@ -1543,7 +1475,7 @@
                 <w:noProof/>
                 <w:webHidden/>
               </w:rPr>
-              <w:t>16</w:t>
+              <w:t>15</w:t>
             </w:r>
             <w:r>
               <w:rPr>
@@ -1617,7 +1549,7 @@
                 <w:noProof/>
                 <w:webHidden/>
               </w:rPr>
-              <w:t>20</w:t>
+              <w:t>19</w:t>
             </w:r>
             <w:r>
               <w:rPr>
@@ -1631,10 +1563,6 @@
         <w:p>
           <w:pPr>
             <w:pStyle w:val="TJ3"/>
-            <w:tabs>
-              <w:tab w:val="right" w:leader="dot" w:pos="9019"/>
-            </w:tabs>
-            <w:spacing w:line="240" w:lineRule="auto"/>
             <w:rPr>
               <w:rFonts w:asciiTheme="minorHAnsi" w:eastAsiaTheme="minorEastAsia" w:hAnsiTheme="minorHAnsi" w:cstheme="minorBidi"/>
               <w:noProof/>
@@ -1691,7 +1619,7 @@
                 <w:noProof/>
                 <w:webHidden/>
               </w:rPr>
-              <w:t>20</w:t>
+              <w:t>19</w:t>
             </w:r>
             <w:r>
               <w:rPr>
@@ -1705,10 +1633,6 @@
         <w:p>
           <w:pPr>
             <w:pStyle w:val="TJ3"/>
-            <w:tabs>
-              <w:tab w:val="right" w:leader="dot" w:pos="9019"/>
-            </w:tabs>
-            <w:spacing w:line="240" w:lineRule="auto"/>
             <w:rPr>
               <w:rFonts w:asciiTheme="minorHAnsi" w:eastAsiaTheme="minorEastAsia" w:hAnsiTheme="minorHAnsi" w:cstheme="minorBidi"/>
               <w:noProof/>
@@ -1765,7 +1689,7 @@
                 <w:noProof/>
                 <w:webHidden/>
               </w:rPr>
-              <w:t>20</w:t>
+              <w:t>19</w:t>
             </w:r>
             <w:r>
               <w:rPr>
@@ -1779,10 +1703,6 @@
         <w:p>
           <w:pPr>
             <w:pStyle w:val="TJ3"/>
-            <w:tabs>
-              <w:tab w:val="right" w:leader="dot" w:pos="9019"/>
-            </w:tabs>
-            <w:spacing w:line="240" w:lineRule="auto"/>
             <w:rPr>
               <w:rFonts w:asciiTheme="minorHAnsi" w:eastAsiaTheme="minorEastAsia" w:hAnsiTheme="minorHAnsi" w:cstheme="minorBidi"/>
               <w:noProof/>
@@ -1839,7 +1759,7 @@
                 <w:noProof/>
                 <w:webHidden/>
               </w:rPr>
-              <w:t>21</w:t>
+              <w:t>20</w:t>
             </w:r>
             <w:r>
               <w:rPr>
@@ -1913,7 +1833,7 @@
                 <w:noProof/>
                 <w:webHidden/>
               </w:rPr>
-              <w:t>24</w:t>
+              <w:t>23</w:t>
             </w:r>
             <w:r>
               <w:rPr>
@@ -1927,10 +1847,6 @@
         <w:p>
           <w:pPr>
             <w:pStyle w:val="TJ3"/>
-            <w:tabs>
-              <w:tab w:val="right" w:leader="dot" w:pos="9019"/>
-            </w:tabs>
-            <w:spacing w:line="240" w:lineRule="auto"/>
             <w:rPr>
               <w:rFonts w:asciiTheme="minorHAnsi" w:eastAsiaTheme="minorEastAsia" w:hAnsiTheme="minorHAnsi" w:cstheme="minorBidi"/>
               <w:noProof/>
@@ -1946,21 +1862,7 @@
                 <w:rStyle w:val="Hiperhivatkozs"/>
                 <w:noProof/>
               </w:rPr>
-              <w:t>0.2 kia</w:t>
-            </w:r>
-            <w:r>
-              <w:rPr>
-                <w:rStyle w:val="Hiperhivatkozs"/>
-                <w:noProof/>
-              </w:rPr>
-              <w:t>d</w:t>
-            </w:r>
-            <w:r>
-              <w:rPr>
-                <w:rStyle w:val="Hiperhivatkozs"/>
-                <w:noProof/>
-              </w:rPr>
-              <w:t>ás</w:t>
+              <w:t>0.2 kiadás</w:t>
             </w:r>
             <w:r>
               <w:rPr>
@@ -2001,7 +1903,7 @@
                 <w:noProof/>
                 <w:webHidden/>
               </w:rPr>
-              <w:t>24</w:t>
+              <w:t>23</w:t>
             </w:r>
             <w:r>
               <w:rPr>
@@ -2015,10 +1917,6 @@
         <w:p>
           <w:pPr>
             <w:pStyle w:val="TJ3"/>
-            <w:tabs>
-              <w:tab w:val="right" w:leader="dot" w:pos="9019"/>
-            </w:tabs>
-            <w:spacing w:line="240" w:lineRule="auto"/>
             <w:rPr>
               <w:rFonts w:asciiTheme="minorHAnsi" w:eastAsiaTheme="minorEastAsia" w:hAnsiTheme="minorHAnsi" w:cstheme="minorBidi"/>
               <w:noProof/>
@@ -2075,7 +1973,7 @@
                 <w:noProof/>
                 <w:webHidden/>
               </w:rPr>
-              <w:t>24</w:t>
+              <w:t>23</w:t>
             </w:r>
             <w:r>
               <w:rPr>
@@ -2145,7 +2043,7 @@
                 <w:noProof/>
                 <w:webHidden/>
               </w:rPr>
-              <w:t>26</w:t>
+              <w:t>25</w:t>
             </w:r>
             <w:r>
               <w:rPr>
@@ -2219,7 +2117,7 @@
                 <w:noProof/>
                 <w:webHidden/>
               </w:rPr>
-              <w:t>26</w:t>
+              <w:t>25</w:t>
             </w:r>
             <w:r>
               <w:rPr>
@@ -2293,7 +2191,7 @@
                 <w:noProof/>
                 <w:webHidden/>
               </w:rPr>
-              <w:t>27</w:t>
+              <w:t>26</w:t>
             </w:r>
             <w:r>
               <w:rPr>
@@ -2367,7 +2265,7 @@
                 <w:noProof/>
                 <w:webHidden/>
               </w:rPr>
-              <w:t>27</w:t>
+              <w:t>26</w:t>
             </w:r>
             <w:r>
               <w:rPr>
@@ -2437,7 +2335,7 @@
                 <w:noProof/>
                 <w:webHidden/>
               </w:rPr>
-              <w:t>28</w:t>
+              <w:t>27</w:t>
             </w:r>
             <w:r>
               <w:rPr>
@@ -4391,8 +4289,8 @@
       </w:pPr>
       <w:bookmarkStart w:id="25" w:name="_nhv3kjoxcuef" w:colFirst="0" w:colLast="0"/>
       <w:bookmarkStart w:id="26" w:name="_xkhrf2qcrxzs" w:colFirst="0" w:colLast="0"/>
-      <w:bookmarkStart w:id="27" w:name="_Hlk227407387"/>
-      <w:bookmarkStart w:id="28" w:name="_Toc229058142"/>
+      <w:bookmarkStart w:id="27" w:name="_Toc229058142"/>
+      <w:bookmarkStart w:id="28" w:name="_Hlk227407387"/>
       <w:bookmarkEnd w:id="25"/>
       <w:bookmarkEnd w:id="26"/>
       <w:r>
@@ -4418,7 +4316,7 @@
         </w:rPr>
         <w:t>leírás</w:t>
       </w:r>
-      <w:bookmarkEnd w:id="28"/>
+      <w:bookmarkEnd w:id="27"/>
     </w:p>
     <w:p>
       <w:pPr>
@@ -7588,61 +7486,15 @@
           <w:color w:val="188038"/>
           <w:szCs w:val="24"/>
         </w:rPr>
-        <w:t xml:space="preserve"> DATETIME DEFAULT (</w:t>
-      </w:r>
-      <w:proofErr w:type="gramStart"/>
-      <w:r>
-        <w:rPr>
-          <w:rFonts w:eastAsia="Times New Roman" w:cs="Times New Roman"/>
-          <w:color w:val="188038"/>
-          <w:szCs w:val="24"/>
-        </w:rPr>
-        <w:t>DATETIME(</w:t>
-      </w:r>
-      <w:proofErr w:type="gramEnd"/>
-      <w:r>
-        <w:rPr>
-          <w:rFonts w:eastAsia="Times New Roman" w:cs="Times New Roman"/>
-          <w:color w:val="188038"/>
-          <w:szCs w:val="24"/>
-        </w:rPr>
-        <w:t>'</w:t>
-      </w:r>
-      <w:proofErr w:type="spellStart"/>
-      <w:r>
-        <w:rPr>
-          <w:rFonts w:eastAsia="Times New Roman" w:cs="Times New Roman"/>
-          <w:color w:val="188038"/>
-          <w:szCs w:val="24"/>
-        </w:rPr>
-        <w:t>now</w:t>
-      </w:r>
-      <w:proofErr w:type="spellEnd"/>
-      <w:r>
-        <w:rPr>
-          <w:rFonts w:eastAsia="Times New Roman" w:cs="Times New Roman"/>
-          <w:color w:val="188038"/>
-          <w:szCs w:val="24"/>
-        </w:rPr>
-        <w:t xml:space="preserve">', '+10 </w:t>
-      </w:r>
-      <w:proofErr w:type="spellStart"/>
-      <w:r>
-        <w:rPr>
-          <w:rFonts w:eastAsia="Times New Roman" w:cs="Times New Roman"/>
-          <w:color w:val="188038"/>
-          <w:szCs w:val="24"/>
-        </w:rPr>
-        <w:t>minutes</w:t>
-      </w:r>
-      <w:proofErr w:type="spellEnd"/>
-      <w:r>
-        <w:rPr>
-          <w:rFonts w:eastAsia="Times New Roman" w:cs="Times New Roman"/>
-          <w:color w:val="188038"/>
-          <w:szCs w:val="24"/>
-        </w:rPr>
-        <w:t>')),</w:t>
+        <w:t xml:space="preserve"> </w:t>
+      </w:r>
+      <w:r>
+        <w:rPr>
+          <w:rFonts w:eastAsia="Times New Roman" w:cs="Times New Roman"/>
+          <w:color w:val="188038"/>
+          <w:szCs w:val="24"/>
+        </w:rPr>
+        <w:t>INT NOT NULL,</w:t>
       </w:r>
     </w:p>
     <w:p>
@@ -7986,6 +7838,14 @@
           <w:szCs w:val="24"/>
         </w:rPr>
         <w:t>NOT NULL</w:t>
+      </w:r>
+      <w:r>
+        <w:rPr>
+          <w:rFonts w:eastAsia="Times New Roman" w:cs="Times New Roman"/>
+          <w:color w:val="188038"/>
+          <w:szCs w:val="24"/>
+        </w:rPr>
+        <w:t>,</w:t>
       </w:r>
     </w:p>
     <w:p>
@@ -8761,7 +8621,7 @@
         <w:pStyle w:val="Cmsor2"/>
       </w:pPr>
       <w:bookmarkStart w:id="44" w:name="_Toc229058147"/>
-      <w:bookmarkEnd w:id="27"/>
+      <w:bookmarkEnd w:id="28"/>
       <w:r>
         <w:lastRenderedPageBreak/>
         <w:t>API dokumentáció</w:t>
@@ -11130,7 +10990,7 @@
                 <w:rFonts w:eastAsia="Times New Roman" w:cs="Times New Roman"/>
                 <w:szCs w:val="24"/>
               </w:rPr>
-              <w:t>PUT</w:t>
+              <w:t>POST</w:t>
             </w:r>
           </w:p>
         </w:tc>
@@ -19762,8 +19622,48 @@
           <w:bCs/>
           <w:szCs w:val="24"/>
         </w:rPr>
-        <w:t xml:space="preserve"> környezet telepítése</w:t>
-      </w:r>
+        <w:t xml:space="preserve"> –</w:t>
+      </w:r>
+      <w:r>
+        <w:rPr>
+          <w:rFonts w:eastAsia="Times New Roman" w:cs="Times New Roman"/>
+          <w:b/>
+          <w:bCs/>
+          <w:szCs w:val="24"/>
+        </w:rPr>
+        <w:t xml:space="preserve"> </w:t>
+      </w:r>
+      <w:proofErr w:type="spellStart"/>
+      <w:r>
+        <w:rPr>
+          <w:rFonts w:eastAsia="Times New Roman" w:cs="Times New Roman"/>
+          <w:b/>
+          <w:bCs/>
+          <w:szCs w:val="24"/>
+        </w:rPr>
+        <w:t>Enviroment</w:t>
+      </w:r>
+      <w:proofErr w:type="spellEnd"/>
+      <w:r>
+        <w:rPr>
+          <w:rFonts w:eastAsia="Times New Roman" w:cs="Times New Roman"/>
+          <w:b/>
+          <w:bCs/>
+          <w:szCs w:val="24"/>
+        </w:rPr>
+        <w:t xml:space="preserve"> </w:t>
+      </w:r>
+      <w:proofErr w:type="spellStart"/>
+      <w:r>
+        <w:rPr>
+          <w:rFonts w:eastAsia="Times New Roman" w:cs="Times New Roman"/>
+          <w:b/>
+          <w:bCs/>
+          <w:szCs w:val="24"/>
+        </w:rPr>
+        <w:t>Setup</w:t>
+      </w:r>
+      <w:proofErr w:type="spellEnd"/>
     </w:p>
     <w:p>
       <w:pPr>
@@ -19819,9 +19719,8 @@
           <w:bCs/>
           <w:szCs w:val="24"/>
         </w:rPr>
-        <w:t xml:space="preserve"> </w:t>
-      </w:r>
-      <w:proofErr w:type="spellStart"/>
+        <w:t xml:space="preserve"> –</w:t>
+      </w:r>
       <w:r>
         <w:rPr>
           <w:rFonts w:eastAsia="Times New Roman" w:cs="Times New Roman"/>
@@ -19829,9 +19728,8 @@
           <w:bCs/>
           <w:szCs w:val="24"/>
         </w:rPr>
-        <w:t>push</w:t>
-      </w:r>
-      <w:proofErr w:type="spellEnd"/>
+        <w:t xml:space="preserve"> </w:t>
+      </w:r>
       <w:r>
         <w:rPr>
           <w:rFonts w:eastAsia="Times New Roman" w:cs="Times New Roman"/>
@@ -19839,8 +19737,39 @@
           <w:bCs/>
           <w:szCs w:val="24"/>
         </w:rPr>
-        <w:t xml:space="preserve"> értesítés </w:t>
-      </w:r>
+        <w:t xml:space="preserve">React </w:t>
+      </w:r>
+      <w:proofErr w:type="spellStart"/>
+      <w:r>
+        <w:rPr>
+          <w:rFonts w:eastAsia="Times New Roman" w:cs="Times New Roman"/>
+          <w:b/>
+          <w:bCs/>
+          <w:szCs w:val="24"/>
+        </w:rPr>
+        <w:t>Native</w:t>
+      </w:r>
+      <w:proofErr w:type="spellEnd"/>
+      <w:r>
+        <w:rPr>
+          <w:rFonts w:eastAsia="Times New Roman" w:cs="Times New Roman"/>
+          <w:b/>
+          <w:bCs/>
+          <w:szCs w:val="24"/>
+        </w:rPr>
+        <w:t xml:space="preserve"> </w:t>
+      </w:r>
+      <w:proofErr w:type="spellStart"/>
+      <w:r>
+        <w:rPr>
+          <w:rFonts w:eastAsia="Times New Roman" w:cs="Times New Roman"/>
+          <w:b/>
+          <w:bCs/>
+          <w:szCs w:val="24"/>
+        </w:rPr>
+        <w:t>Notifications</w:t>
+      </w:r>
+      <w:proofErr w:type="spellEnd"/>
     </w:p>
     <w:p>
       <w:pPr>
@@ -19869,7 +19798,6 @@
           <w:szCs w:val="24"/>
         </w:rPr>
       </w:pPr>
-      <w:proofErr w:type="spellStart"/>
       <w:r>
         <w:rPr>
           <w:rFonts w:eastAsia="Times New Roman" w:cs="Times New Roman"/>
@@ -19877,9 +19805,9 @@
           <w:bCs/>
           <w:szCs w:val="24"/>
         </w:rPr>
-        <w:t>Async</w:t>
-      </w:r>
-      <w:proofErr w:type="spellEnd"/>
+        <w:t xml:space="preserve">React </w:t>
+      </w:r>
+      <w:proofErr w:type="spellStart"/>
       <w:r>
         <w:rPr>
           <w:rFonts w:eastAsia="Times New Roman" w:cs="Times New Roman"/>
@@ -19887,8 +19815,58 @@
           <w:bCs/>
           <w:szCs w:val="24"/>
         </w:rPr>
-        <w:t xml:space="preserve"> Storage használata</w:t>
-      </w:r>
+        <w:t>Native</w:t>
+      </w:r>
+      <w:proofErr w:type="spellEnd"/>
+      <w:r>
+        <w:rPr>
+          <w:rFonts w:eastAsia="Times New Roman" w:cs="Times New Roman"/>
+          <w:b/>
+          <w:bCs/>
+          <w:szCs w:val="24"/>
+        </w:rPr>
+        <w:t xml:space="preserve"> </w:t>
+      </w:r>
+      <w:r>
+        <w:rPr>
+          <w:rFonts w:eastAsia="Times New Roman" w:cs="Times New Roman"/>
+          <w:b/>
+          <w:bCs/>
+          <w:szCs w:val="24"/>
+        </w:rPr>
+        <w:t xml:space="preserve">– React </w:t>
+      </w:r>
+      <w:proofErr w:type="spellStart"/>
+      <w:r>
+        <w:rPr>
+          <w:rFonts w:eastAsia="Times New Roman" w:cs="Times New Roman"/>
+          <w:b/>
+          <w:bCs/>
+          <w:szCs w:val="24"/>
+        </w:rPr>
+        <w:t>Native</w:t>
+      </w:r>
+      <w:proofErr w:type="spellEnd"/>
+      <w:r>
+        <w:rPr>
+          <w:rFonts w:eastAsia="Times New Roman" w:cs="Times New Roman"/>
+          <w:b/>
+          <w:bCs/>
+          <w:szCs w:val="24"/>
+        </w:rPr>
+        <w:t xml:space="preserve"> </w:t>
+      </w:r>
+      <w:proofErr w:type="spellStart"/>
+      <w:r>
+        <w:rPr>
+          <w:rFonts w:eastAsia="Times New Roman" w:cs="Times New Roman"/>
+          <w:b/>
+          <w:bCs/>
+          <w:szCs w:val="24"/>
+        </w:rPr>
+        <w:t>Calendars</w:t>
+      </w:r>
+      <w:proofErr w:type="spellEnd"/>
     </w:p>
     <w:p>
       <w:pPr>
@@ -19904,7 +19882,7 @@
             <w:rFonts w:eastAsia="Times New Roman" w:cs="Times New Roman"/>
             <w:szCs w:val="24"/>
           </w:rPr>
-          <w:t>https://github.com/react-native-async-storage/async-storage</w:t>
+          <w:t>https://www.npmjs.com/package/react-native-calendars</w:t>
         </w:r>
       </w:hyperlink>
     </w:p>
@@ -19917,7 +19895,6 @@
           <w:szCs w:val="24"/>
         </w:rPr>
       </w:pPr>
-      <w:proofErr w:type="spellStart"/>
       <w:r>
         <w:rPr>
           <w:rFonts w:eastAsia="Times New Roman" w:cs="Times New Roman"/>
@@ -19925,9 +19902,9 @@
           <w:bCs/>
           <w:szCs w:val="24"/>
         </w:rPr>
-        <w:t>Javascript</w:t>
-      </w:r>
-      <w:proofErr w:type="spellEnd"/>
+        <w:t xml:space="preserve">React </w:t>
+      </w:r>
+      <w:proofErr w:type="spellStart"/>
       <w:r>
         <w:rPr>
           <w:rFonts w:eastAsia="Times New Roman" w:cs="Times New Roman"/>
@@ -19935,8 +19912,58 @@
           <w:bCs/>
           <w:szCs w:val="24"/>
         </w:rPr>
-        <w:t xml:space="preserve"> tömb mutáció</w:t>
-      </w:r>
+        <w:t>Native</w:t>
+      </w:r>
+      <w:proofErr w:type="spellEnd"/>
+      <w:r>
+        <w:rPr>
+          <w:rFonts w:eastAsia="Times New Roman" w:cs="Times New Roman"/>
+          <w:b/>
+          <w:bCs/>
+          <w:szCs w:val="24"/>
+        </w:rPr>
+        <w:t xml:space="preserve"> –</w:t>
+      </w:r>
+      <w:r>
+        <w:rPr>
+          <w:rFonts w:eastAsia="Times New Roman" w:cs="Times New Roman"/>
+          <w:b/>
+          <w:bCs/>
+          <w:szCs w:val="24"/>
+        </w:rPr>
+        <w:t xml:space="preserve"> </w:t>
+      </w:r>
+      <w:proofErr w:type="spellStart"/>
+      <w:r>
+        <w:rPr>
+          <w:rFonts w:eastAsia="Times New Roman" w:cs="Times New Roman"/>
+          <w:b/>
+          <w:bCs/>
+          <w:szCs w:val="24"/>
+        </w:rPr>
+        <w:t>Bottom</w:t>
+      </w:r>
+      <w:proofErr w:type="spellEnd"/>
+      <w:r>
+        <w:rPr>
+          <w:rFonts w:eastAsia="Times New Roman" w:cs="Times New Roman"/>
+          <w:b/>
+          <w:bCs/>
+          <w:szCs w:val="24"/>
+        </w:rPr>
+        <w:t xml:space="preserve"> Tab </w:t>
+      </w:r>
+      <w:proofErr w:type="spellStart"/>
+      <w:r>
+        <w:rPr>
+          <w:rFonts w:eastAsia="Times New Roman" w:cs="Times New Roman"/>
+          <w:b/>
+          <w:bCs/>
+          <w:szCs w:val="24"/>
+        </w:rPr>
+        <w:t>Navigation</w:t>
+      </w:r>
+      <w:proofErr w:type="spellEnd"/>
     </w:p>
     <w:p>
       <w:pPr>
@@ -19952,7 +19979,7 @@
             <w:rFonts w:eastAsia="Times New Roman" w:cs="Times New Roman"/>
             <w:szCs w:val="24"/>
           </w:rPr>
-          <w:t>https://developer.mozilla.org/en-US/docs/Web/JavaScript/Reference/Global_Objects/Array/from</w:t>
+          <w:t>https://reactnavigation.org/docs/bottom-tab-navigator/</w:t>
         </w:r>
       </w:hyperlink>
     </w:p>
@@ -19965,7 +19992,6 @@
           <w:szCs w:val="24"/>
         </w:rPr>
       </w:pPr>
-      <w:proofErr w:type="spellStart"/>
       <w:r>
         <w:rPr>
           <w:rFonts w:eastAsia="Times New Roman" w:cs="Times New Roman"/>
@@ -19973,9 +19999,9 @@
           <w:bCs/>
           <w:szCs w:val="24"/>
         </w:rPr>
-        <w:t>Nodejs</w:t>
-      </w:r>
-      <w:proofErr w:type="spellEnd"/>
+        <w:t xml:space="preserve">React </w:t>
+      </w:r>
+      <w:proofErr w:type="spellStart"/>
       <w:r>
         <w:rPr>
           <w:rFonts w:eastAsia="Times New Roman" w:cs="Times New Roman"/>
@@ -19983,9 +20009,9 @@
           <w:bCs/>
           <w:szCs w:val="24"/>
         </w:rPr>
-        <w:t xml:space="preserve"> </w:t>
-      </w:r>
-      <w:proofErr w:type="spellStart"/>
+        <w:t>Native</w:t>
+      </w:r>
+      <w:proofErr w:type="spellEnd"/>
       <w:r>
         <w:rPr>
           <w:rFonts w:eastAsia="Times New Roman" w:cs="Times New Roman"/>
@@ -19993,9 +20019,9 @@
           <w:bCs/>
           <w:szCs w:val="24"/>
         </w:rPr>
-        <w:t>dotenv</w:t>
-      </w:r>
-      <w:proofErr w:type="spellEnd"/>
+        <w:t xml:space="preserve"> - </w:t>
+      </w:r>
+      <w:proofErr w:type="spellStart"/>
       <w:r>
         <w:rPr>
           <w:rFonts w:eastAsia="Times New Roman" w:cs="Times New Roman"/>
@@ -20003,17 +20029,257 @@
           <w:bCs/>
           <w:szCs w:val="24"/>
         </w:rPr>
-        <w:t xml:space="preserve"> környezeti változó beolvasása</w:t>
-      </w:r>
-    </w:p>
-    <w:p>
-      <w:pPr>
-        <w:rPr>
-          <w:rFonts w:eastAsia="Times New Roman" w:cs="Times New Roman"/>
-          <w:szCs w:val="24"/>
-        </w:rPr>
-      </w:pPr>
+        <w:t>Async</w:t>
+      </w:r>
+      <w:proofErr w:type="spellEnd"/>
+      <w:r>
+        <w:rPr>
+          <w:rFonts w:eastAsia="Times New Roman" w:cs="Times New Roman"/>
+          <w:b/>
+          <w:bCs/>
+          <w:szCs w:val="24"/>
+        </w:rPr>
+        <w:t xml:space="preserve"> Storage</w:t>
+      </w:r>
+    </w:p>
+    <w:p>
       <w:hyperlink r:id="rId13" w:history="1">
+        <w:r>
+          <w:rPr>
+            <w:rStyle w:val="Hiperhivatkozs"/>
+          </w:rPr>
+          <w:t>https://react-native-async-storage.github.io/3.0/</w:t>
+        </w:r>
+      </w:hyperlink>
+    </w:p>
+    <w:p>
+      <w:pPr>
+        <w:rPr>
+          <w:rFonts w:eastAsia="Times New Roman" w:cs="Times New Roman"/>
+          <w:b/>
+          <w:bCs/>
+          <w:szCs w:val="24"/>
+        </w:rPr>
+      </w:pPr>
+      <w:r>
+        <w:rPr>
+          <w:rFonts w:eastAsia="Times New Roman" w:cs="Times New Roman"/>
+          <w:b/>
+          <w:bCs/>
+          <w:szCs w:val="24"/>
+        </w:rPr>
+        <w:t xml:space="preserve">React </w:t>
+      </w:r>
+      <w:proofErr w:type="spellStart"/>
+      <w:r>
+        <w:rPr>
+          <w:rFonts w:eastAsia="Times New Roman" w:cs="Times New Roman"/>
+          <w:b/>
+          <w:bCs/>
+          <w:szCs w:val="24"/>
+        </w:rPr>
+        <w:t>Native</w:t>
+      </w:r>
+      <w:proofErr w:type="spellEnd"/>
+      <w:r>
+        <w:rPr>
+          <w:rFonts w:eastAsia="Times New Roman" w:cs="Times New Roman"/>
+          <w:b/>
+          <w:bCs/>
+          <w:szCs w:val="24"/>
+        </w:rPr>
+        <w:t xml:space="preserve"> </w:t>
+      </w:r>
+      <w:r>
+        <w:rPr>
+          <w:rFonts w:eastAsia="Times New Roman" w:cs="Times New Roman"/>
+          <w:b/>
+          <w:bCs/>
+          <w:szCs w:val="24"/>
+        </w:rPr>
+        <w:t xml:space="preserve">- </w:t>
+      </w:r>
+      <w:proofErr w:type="spellStart"/>
+      <w:r>
+        <w:rPr>
+          <w:rFonts w:eastAsia="Times New Roman" w:cs="Times New Roman"/>
+          <w:b/>
+          <w:bCs/>
+          <w:szCs w:val="24"/>
+        </w:rPr>
+        <w:t>createContext</w:t>
+      </w:r>
+      <w:proofErr w:type="spellEnd"/>
+    </w:p>
+    <w:p>
+      <w:pPr>
+        <w:rPr>
+          <w:rFonts w:eastAsia="Times New Roman" w:cs="Times New Roman"/>
+          <w:szCs w:val="24"/>
+        </w:rPr>
+      </w:pPr>
+      <w:hyperlink r:id="rId14" w:history="1">
+        <w:r>
+          <w:rPr>
+            <w:rStyle w:val="Hiperhivatkozs"/>
+            <w:rFonts w:eastAsia="Times New Roman" w:cs="Times New Roman"/>
+            <w:szCs w:val="24"/>
+          </w:rPr>
+          <w:t>https://react.dev/reference/react/createContext</w:t>
+        </w:r>
+      </w:hyperlink>
+    </w:p>
+    <w:p>
+      <w:pPr>
+        <w:rPr>
+          <w:rFonts w:eastAsia="Times New Roman" w:cs="Times New Roman"/>
+          <w:b/>
+          <w:bCs/>
+          <w:szCs w:val="24"/>
+        </w:rPr>
+      </w:pPr>
+      <w:r>
+        <w:rPr>
+          <w:rFonts w:eastAsia="Times New Roman" w:cs="Times New Roman"/>
+          <w:b/>
+          <w:bCs/>
+          <w:szCs w:val="24"/>
+        </w:rPr>
+        <w:t xml:space="preserve">MDN Web </w:t>
+      </w:r>
+      <w:proofErr w:type="spellStart"/>
+      <w:r>
+        <w:rPr>
+          <w:rFonts w:eastAsia="Times New Roman" w:cs="Times New Roman"/>
+          <w:b/>
+          <w:bCs/>
+          <w:szCs w:val="24"/>
+        </w:rPr>
+        <w:t>Docs</w:t>
+      </w:r>
+      <w:proofErr w:type="spellEnd"/>
+      <w:r>
+        <w:rPr>
+          <w:rFonts w:eastAsia="Times New Roman" w:cs="Times New Roman"/>
+          <w:b/>
+          <w:bCs/>
+          <w:szCs w:val="24"/>
+        </w:rPr>
+        <w:t xml:space="preserve"> - </w:t>
+      </w:r>
+      <w:proofErr w:type="spellStart"/>
+      <w:r>
+        <w:rPr>
+          <w:rFonts w:eastAsia="Times New Roman" w:cs="Times New Roman"/>
+          <w:b/>
+          <w:bCs/>
+          <w:szCs w:val="24"/>
+        </w:rPr>
+        <w:t>Javascript</w:t>
+      </w:r>
+      <w:proofErr w:type="spellEnd"/>
+      <w:r>
+        <w:rPr>
+          <w:rFonts w:eastAsia="Times New Roman" w:cs="Times New Roman"/>
+          <w:b/>
+          <w:bCs/>
+          <w:szCs w:val="24"/>
+        </w:rPr>
+        <w:t xml:space="preserve"> tömb mutáció</w:t>
+      </w:r>
+    </w:p>
+    <w:p>
+      <w:pPr>
+        <w:rPr>
+          <w:rFonts w:eastAsia="Times New Roman" w:cs="Times New Roman"/>
+          <w:szCs w:val="24"/>
+        </w:rPr>
+      </w:pPr>
+      <w:hyperlink r:id="rId15" w:history="1">
+        <w:r>
+          <w:rPr>
+            <w:rStyle w:val="Hiperhivatkozs"/>
+            <w:rFonts w:eastAsia="Times New Roman" w:cs="Times New Roman"/>
+            <w:szCs w:val="24"/>
+          </w:rPr>
+          <w:t>https://developer.mozil</w:t>
+        </w:r>
+        <w:r>
+          <w:rPr>
+            <w:rStyle w:val="Hiperhivatkozs"/>
+            <w:rFonts w:eastAsia="Times New Roman" w:cs="Times New Roman"/>
+            <w:szCs w:val="24"/>
+          </w:rPr>
+          <w:t>l</w:t>
+        </w:r>
+        <w:r>
+          <w:rPr>
+            <w:rStyle w:val="Hiperhivatkozs"/>
+            <w:rFonts w:eastAsia="Times New Roman" w:cs="Times New Roman"/>
+            <w:szCs w:val="24"/>
+          </w:rPr>
+          <w:t>a.org/en-US/docs/Web/JavaScript/Reference/Global_Objects/Array/from</w:t>
+        </w:r>
+      </w:hyperlink>
+    </w:p>
+    <w:p>
+      <w:pPr>
+        <w:rPr>
+          <w:rFonts w:eastAsia="Times New Roman" w:cs="Times New Roman"/>
+          <w:b/>
+          <w:bCs/>
+          <w:szCs w:val="24"/>
+        </w:rPr>
+      </w:pPr>
+      <w:proofErr w:type="spellStart"/>
+      <w:r>
+        <w:rPr>
+          <w:rFonts w:eastAsia="Times New Roman" w:cs="Times New Roman"/>
+          <w:b/>
+          <w:bCs/>
+          <w:szCs w:val="24"/>
+        </w:rPr>
+        <w:t>Nodejs</w:t>
+      </w:r>
+      <w:proofErr w:type="spellEnd"/>
+      <w:r>
+        <w:rPr>
+          <w:rFonts w:eastAsia="Times New Roman" w:cs="Times New Roman"/>
+          <w:b/>
+          <w:bCs/>
+          <w:szCs w:val="24"/>
+        </w:rPr>
+        <w:t xml:space="preserve"> -</w:t>
+      </w:r>
+      <w:r>
+        <w:rPr>
+          <w:rFonts w:eastAsia="Times New Roman" w:cs="Times New Roman"/>
+          <w:b/>
+          <w:bCs/>
+          <w:szCs w:val="24"/>
+        </w:rPr>
+        <w:t xml:space="preserve"> </w:t>
+      </w:r>
+      <w:proofErr w:type="spellStart"/>
+      <w:r>
+        <w:rPr>
+          <w:rFonts w:eastAsia="Times New Roman" w:cs="Times New Roman"/>
+          <w:b/>
+          <w:bCs/>
+          <w:szCs w:val="24"/>
+        </w:rPr>
+        <w:t>Dotenv</w:t>
+      </w:r>
+      <w:proofErr w:type="spellEnd"/>
+    </w:p>
+    <w:p>
+      <w:pPr>
+        <w:rPr>
+          <w:rFonts w:eastAsia="Times New Roman" w:cs="Times New Roman"/>
+          <w:szCs w:val="24"/>
+        </w:rPr>
+      </w:pPr>
+      <w:hyperlink r:id="rId16" w:history="1">
         <w:r>
           <w:rPr>
             <w:rStyle w:val="Hiperhivatkozs"/>
@@ -20040,9 +20306,8 @@
           <w:bCs/>
           <w:szCs w:val="24"/>
         </w:rPr>
-        <w:t>Expo-</w:t>
-      </w:r>
-      <w:proofErr w:type="spellStart"/>
+        <w:t>Expo</w:t>
+      </w:r>
       <w:r>
         <w:rPr>
           <w:rFonts w:eastAsia="Times New Roman" w:cs="Times New Roman"/>
@@ -20050,9 +20315,9 @@
           <w:bCs/>
           <w:szCs w:val="24"/>
         </w:rPr>
-        <w:t>constants</w:t>
-      </w:r>
-      <w:proofErr w:type="spellEnd"/>
+        <w:t xml:space="preserve"> – Expo </w:t>
+      </w:r>
+      <w:proofErr w:type="spellStart"/>
       <w:r>
         <w:rPr>
           <w:rFonts w:eastAsia="Times New Roman" w:cs="Times New Roman"/>
@@ -20060,17 +20325,18 @@
           <w:bCs/>
           <w:szCs w:val="24"/>
         </w:rPr>
-        <w:t xml:space="preserve"> használata</w:t>
-      </w:r>
-    </w:p>
-    <w:p>
-      <w:pPr>
-        <w:rPr>
-          <w:rFonts w:eastAsia="Times New Roman" w:cs="Times New Roman"/>
-          <w:szCs w:val="24"/>
-        </w:rPr>
-      </w:pPr>
-      <w:hyperlink r:id="rId14" w:history="1">
+        <w:t>Constants</w:t>
+      </w:r>
+      <w:proofErr w:type="spellEnd"/>
+    </w:p>
+    <w:p>
+      <w:pPr>
+        <w:rPr>
+          <w:rFonts w:eastAsia="Times New Roman" w:cs="Times New Roman"/>
+          <w:szCs w:val="24"/>
+        </w:rPr>
+      </w:pPr>
+      <w:hyperlink r:id="rId17" w:history="1">
         <w:r>
           <w:rPr>
             <w:rStyle w:val="Hiperhivatkozs"/>
@@ -20097,9 +20363,8 @@
           <w:bCs/>
           <w:szCs w:val="24"/>
         </w:rPr>
-        <w:t xml:space="preserve">React </w:t>
-      </w:r>
-      <w:proofErr w:type="spellStart"/>
+        <w:t>Expo</w:t>
+      </w:r>
       <w:r>
         <w:rPr>
           <w:rFonts w:eastAsia="Times New Roman" w:cs="Times New Roman"/>
@@ -20107,9 +20372,8 @@
           <w:bCs/>
           <w:szCs w:val="24"/>
         </w:rPr>
-        <w:t>Native</w:t>
-      </w:r>
-      <w:proofErr w:type="spellEnd"/>
+        <w:t xml:space="preserve"> -</w:t>
+      </w:r>
       <w:r>
         <w:rPr>
           <w:rFonts w:eastAsia="Times New Roman" w:cs="Times New Roman"/>
@@ -20117,24 +20381,35 @@
           <w:bCs/>
           <w:szCs w:val="24"/>
         </w:rPr>
-        <w:t xml:space="preserve"> naptár csomag</w:t>
-      </w:r>
-    </w:p>
-    <w:p>
-      <w:pPr>
-        <w:rPr>
-          <w:rFonts w:eastAsia="Times New Roman" w:cs="Times New Roman"/>
-          <w:szCs w:val="24"/>
-        </w:rPr>
-      </w:pPr>
-      <w:hyperlink r:id="rId15" w:history="1">
+        <w:t xml:space="preserve"> </w:t>
+      </w:r>
+      <w:proofErr w:type="spellStart"/>
+      <w:r>
+        <w:rPr>
+          <w:rFonts w:eastAsia="Times New Roman" w:cs="Times New Roman"/>
+          <w:b/>
+          <w:bCs/>
+          <w:szCs w:val="24"/>
+        </w:rPr>
+        <w:t>Build</w:t>
+      </w:r>
+      <w:proofErr w:type="spellEnd"/>
+    </w:p>
+    <w:p>
+      <w:pPr>
+        <w:rPr>
+          <w:rFonts w:eastAsia="Times New Roman" w:cs="Times New Roman"/>
+          <w:szCs w:val="24"/>
+        </w:rPr>
+      </w:pPr>
+      <w:hyperlink r:id="rId18" w:history="1">
         <w:r>
           <w:rPr>
             <w:rStyle w:val="Hiperhivatkozs"/>
             <w:rFonts w:eastAsia="Times New Roman" w:cs="Times New Roman"/>
             <w:szCs w:val="24"/>
           </w:rPr>
-          <w:t>https://www.npmjs.com/package/react-native-calendars</w:t>
+          <w:t>https://docs.expo.dev/build/introduction/</w:t>
         </w:r>
       </w:hyperlink>
     </w:p>
@@ -20154,9 +20429,8 @@
           <w:bCs/>
           <w:szCs w:val="24"/>
         </w:rPr>
-        <w:t xml:space="preserve">React </w:t>
-      </w:r>
-      <w:proofErr w:type="spellStart"/>
+        <w:t>Ionicons</w:t>
+      </w:r>
       <w:r>
         <w:rPr>
           <w:rFonts w:eastAsia="Times New Roman" w:cs="Times New Roman"/>
@@ -20164,9 +20438,8 @@
           <w:bCs/>
           <w:szCs w:val="24"/>
         </w:rPr>
-        <w:t>Native</w:t>
-      </w:r>
-      <w:proofErr w:type="spellEnd"/>
+        <w:t xml:space="preserve"> -</w:t>
+      </w:r>
       <w:r>
         <w:rPr>
           <w:rFonts w:eastAsia="Times New Roman" w:cs="Times New Roman"/>
@@ -20174,54 +20447,28 @@
           <w:bCs/>
           <w:szCs w:val="24"/>
         </w:rPr>
-        <w:t xml:space="preserve"> navigáció</w:t>
-      </w:r>
-    </w:p>
-    <w:p>
-      <w:pPr>
-        <w:rPr>
-          <w:rFonts w:eastAsia="Times New Roman" w:cs="Times New Roman"/>
-          <w:szCs w:val="24"/>
-        </w:rPr>
-      </w:pPr>
-      <w:hyperlink r:id="rId16" w:history="1">
-        <w:r>
-          <w:rPr>
-            <w:rStyle w:val="Hiperhivatkozs"/>
-            <w:rFonts w:eastAsia="Times New Roman" w:cs="Times New Roman"/>
-            <w:szCs w:val="24"/>
-          </w:rPr>
-          <w:t>https://reactnavigation.org/docs/bottom-tab-navigator/</w:t>
-        </w:r>
-      </w:hyperlink>
-    </w:p>
-    <w:p>
-      <w:pPr>
+        <w:t xml:space="preserve"> </w:t>
+      </w:r>
+      <w:proofErr w:type="spellStart"/>
+      <w:r>
         <w:rPr>
           <w:rFonts w:eastAsia="Times New Roman" w:cs="Times New Roman"/>
           <w:b/>
           <w:bCs/>
           <w:szCs w:val="24"/>
         </w:rPr>
-      </w:pPr>
-      <w:r>
-        <w:rPr>
-          <w:rFonts w:eastAsia="Times New Roman" w:cs="Times New Roman"/>
-          <w:b/>
-          <w:bCs/>
-          <w:szCs w:val="24"/>
-        </w:rPr>
-        <w:t>Ionicons ikonok</w:t>
-      </w:r>
-    </w:p>
-    <w:p>
-      <w:pPr>
-        <w:rPr>
-          <w:rFonts w:eastAsia="Times New Roman" w:cs="Times New Roman"/>
-          <w:szCs w:val="24"/>
-        </w:rPr>
-      </w:pPr>
-      <w:hyperlink r:id="rId17" w:history="1">
+        <w:t>Icons</w:t>
+      </w:r>
+      <w:proofErr w:type="spellEnd"/>
+    </w:p>
+    <w:p>
+      <w:pPr>
+        <w:rPr>
+          <w:rFonts w:eastAsia="Times New Roman" w:cs="Times New Roman"/>
+          <w:szCs w:val="24"/>
+        </w:rPr>
+      </w:pPr>
+      <w:hyperlink r:id="rId19" w:history="1">
         <w:r>
           <w:rPr>
             <w:rStyle w:val="Hiperhivatkozs"/>
@@ -20241,6 +20488,7 @@
           <w:szCs w:val="24"/>
         </w:rPr>
       </w:pPr>
+      <w:proofErr w:type="spellStart"/>
       <w:r>
         <w:rPr>
           <w:rFonts w:eastAsia="Times New Roman" w:cs="Times New Roman"/>
@@ -20248,102 +20496,9 @@
           <w:bCs/>
           <w:szCs w:val="24"/>
         </w:rPr>
-        <w:t>Email küldő szolgáltatás</w:t>
-      </w:r>
-    </w:p>
-    <w:p>
-      <w:pPr>
-        <w:rPr>
-          <w:rFonts w:eastAsia="Times New Roman" w:cs="Times New Roman"/>
-          <w:szCs w:val="24"/>
-        </w:rPr>
-      </w:pPr>
-      <w:hyperlink r:id="rId18" w:history="1">
-        <w:r>
-          <w:rPr>
-            <w:rStyle w:val="Hiperhivatkozs"/>
-            <w:rFonts w:eastAsia="Times New Roman" w:cs="Times New Roman"/>
-            <w:szCs w:val="24"/>
-          </w:rPr>
-          <w:t>https://nodemailer.com/</w:t>
-        </w:r>
-      </w:hyperlink>
-    </w:p>
-    <w:p>
-      <w:pPr>
-        <w:rPr>
-          <w:rFonts w:eastAsia="Times New Roman" w:cs="Times New Roman"/>
-          <w:b/>
-          <w:bCs/>
-          <w:szCs w:val="24"/>
-        </w:rPr>
-      </w:pPr>
-      <w:r>
-        <w:rPr>
-          <w:rFonts w:eastAsia="Times New Roman" w:cs="Times New Roman"/>
-          <w:b/>
-          <w:bCs/>
-          <w:szCs w:val="24"/>
-        </w:rPr>
-        <w:t>Expo projekt összeépítése telepíthető csomaggá</w:t>
-      </w:r>
-    </w:p>
-    <w:p>
-      <w:pPr>
-        <w:rPr>
-          <w:rFonts w:eastAsia="Times New Roman" w:cs="Times New Roman"/>
-          <w:szCs w:val="24"/>
-        </w:rPr>
-      </w:pPr>
-      <w:hyperlink r:id="rId19" w:history="1">
-        <w:r>
-          <w:rPr>
-            <w:rStyle w:val="Hiperhivatkozs"/>
-            <w:rFonts w:eastAsia="Times New Roman" w:cs="Times New Roman"/>
-            <w:szCs w:val="24"/>
-          </w:rPr>
-          <w:t>https://docs.expo.dev/build/introduction/</w:t>
-        </w:r>
-      </w:hyperlink>
-    </w:p>
-    <w:p>
-      <w:pPr>
-        <w:rPr>
-          <w:rFonts w:eastAsia="Times New Roman" w:cs="Times New Roman"/>
-          <w:b/>
-          <w:bCs/>
-          <w:szCs w:val="24"/>
-        </w:rPr>
-      </w:pPr>
-      <w:r>
-        <w:rPr>
-          <w:rFonts w:eastAsia="Times New Roman" w:cs="Times New Roman"/>
-          <w:b/>
-          <w:bCs/>
-          <w:szCs w:val="24"/>
-        </w:rPr>
-        <w:t xml:space="preserve">React </w:t>
-      </w:r>
-      <w:proofErr w:type="spellStart"/>
-      <w:r>
-        <w:rPr>
-          <w:rFonts w:eastAsia="Times New Roman" w:cs="Times New Roman"/>
-          <w:b/>
-          <w:bCs/>
-          <w:szCs w:val="24"/>
-        </w:rPr>
-        <w:t>Native</w:t>
+        <w:t>Nodemailer</w:t>
       </w:r>
       <w:proofErr w:type="spellEnd"/>
-      <w:r>
-        <w:rPr>
-          <w:rFonts w:eastAsia="Times New Roman" w:cs="Times New Roman"/>
-          <w:b/>
-          <w:bCs/>
-          <w:szCs w:val="24"/>
-        </w:rPr>
-        <w:t xml:space="preserve"> kontextus használata</w:t>
-      </w:r>
     </w:p>
     <w:p>
       <w:pPr>
@@ -20359,7 +20514,23 @@
             <w:rFonts w:eastAsia="Times New Roman" w:cs="Times New Roman"/>
             <w:szCs w:val="24"/>
           </w:rPr>
-          <w:t>https://react.dev/reference/react/createContext</w:t>
+          <w:t>https://nodema</w:t>
+        </w:r>
+        <w:r>
+          <w:rPr>
+            <w:rStyle w:val="Hiperhivatkozs"/>
+            <w:rFonts w:eastAsia="Times New Roman" w:cs="Times New Roman"/>
+            <w:szCs w:val="24"/>
+          </w:rPr>
+          <w:t>i</w:t>
+        </w:r>
+        <w:r>
+          <w:rPr>
+            <w:rStyle w:val="Hiperhivatkozs"/>
+            <w:rFonts w:eastAsia="Times New Roman" w:cs="Times New Roman"/>
+            <w:szCs w:val="24"/>
+          </w:rPr>
+          <w:t>ler.com/</w:t>
         </w:r>
       </w:hyperlink>
     </w:p>
@@ -24153,7 +24324,7 @@
     <w:autoRedefine/>
     <w:uiPriority w:val="39"/>
     <w:unhideWhenUsed/>
-    <w:rsid w:val="003F4C8E"/>
+    <w:rsid w:val="00BC797F"/>
     <w:pPr>
       <w:tabs>
         <w:tab w:val="right" w:leader="dot" w:pos="9019"/>
@@ -24168,10 +24339,13 @@
     <w:autoRedefine/>
     <w:uiPriority w:val="39"/>
     <w:unhideWhenUsed/>
-    <w:rsid w:val="00FA1180"/>
+    <w:rsid w:val="00BC797F"/>
     <w:pPr>
-      <w:spacing w:after="100"/>
-      <w:ind w:left="440"/>
+      <w:tabs>
+        <w:tab w:val="right" w:leader="dot" w:pos="9019"/>
+      </w:tabs>
+      <w:spacing w:after="100" w:line="240" w:lineRule="auto"/>
+      <w:ind w:left="442"/>
     </w:pPr>
   </w:style>
   <w:style w:type="paragraph" w:styleId="TJ2">
@@ -24278,6 +24452,18 @@
       <w:b/>
       <w:sz w:val="28"/>
       <w:szCs w:val="28"/>
+    </w:rPr>
+  </w:style>
+  <w:style w:type="character" w:styleId="Mrltotthiperhivatkozs">
+    <w:name w:val="FollowedHyperlink"/>
+    <w:basedOn w:val="Bekezdsalapbettpusa"/>
+    <w:uiPriority w:val="99"/>
+    <w:semiHidden/>
+    <w:unhideWhenUsed/>
+    <w:rsid w:val="009F5D06"/>
+    <w:rPr>
+      <w:color w:val="800080" w:themeColor="followedHyperlink"/>
+      <w:u w:val="single"/>
     </w:rPr>
   </w:style>
 </w:styles>

</xml_diff>